<commit_message>
Bổ sung tài liệu kỹ thuật NLP - liên thông và cập nhật README
- docs/cac-file-nlp-va-lien-thong.md: bản đồ các file NLP và đường đi dữ
  liệu từ Excel danh mục Bộ Y tế tới nlp/data/icd10_db.json.
- docs/chi-tiet-ky-thuat-7-file-loi.md: mô tả chi tiết bảy file lõi -
  đầu vào, đầu ra, dữ liệu đọc/ghi của từng file.
- README.md: cập nhật theo mô hình đa cơ sở (mã cơ sở, tham số của
  run.ps1, cấu hình HAPI FHIR trên PostgreSQL).
- Cong_thuc_toan_hoc_NLP_ICD10.docx: cập nhật phần công thức theo hiệu
  chuẩn độ tin cậy.

Co-Authored-By: Claude Opus 5 (1M context) <noreply@anthropic.com>
</commit_message>
<xml_diff>
--- a/Cong_thuc_toan_hoc_NLP_ICD10.docx
+++ b/Cong_thuc_toan_hoc_NLP_ICD10.docx
@@ -113,11 +113,47 @@
           <w:b/>
           <w:sz w:val="20"/>
         </w:rPr>
-        <w:t>Vị trí: nlp/nlp_engine.py — dòng 904–905</w:t>
+        <w:t>Nguồn gốc của hai vector q và e</w:t>
       </w:r>
     </w:p>
     <w:p>
       <w:pPr>
+        <w:spacing w:after="80"/>
+      </w:pPr>
+      <w:r>
+        <w:t>Cả hai vector đều là đầu ra của cùng một mô hình SBERT nạp tại dòng 167 (thư mục nlp/my_medical_nlp_model, kiến trúc RoBERTa/PhoBERT 12 lớp, hidden_size = 768). Một chuỗi văn bản trở thành vector qua ba bước: (1) PhobertTokenizer tách chuỗi thành các sub-word; (2) 12 lớp Transformer sinh cho mỗi token một vector 768 chiều; (3) mean pooling lấy trung bình các vector token thành đúng một vector 768 chiều đại diện cả câu. Số 768 chính là chiều lớp ẩn của mô hình, không phải tham số chọn tùy ý.</w:t>
+      </w:r>
+    </w:p>
+    <w:p>
+      <w:pPr>
+        <w:spacing w:after="80"/>
+      </w:pPr>
+      <w:r>
+        <w:t>q được mã hóa ngay tại thời điểm truy vấn, từ câu chẩn đoán đã qua expand_query (dòng 904). e được mã hóa sẵn từ danh mục: mỗi mã ICD-10 đóng góp name_vi, name_en và từng từ đồng nghĩa thành những chuỗi riêng (_build_reference_entries, dòng 294), cộng thêm khối alias nối vào ma trận (dòng 436–449) — tổng cộng 48.391 vector, tính một lần rồi lưu cache .npy nên các lần khởi động sau nạp tức thì (dòng 371–387).</w:t>
+      </w:r>
+    </w:p>
+    <w:p>
+      <w:pPr>
+        <w:spacing w:after="80"/>
+      </w:pPr>
+      <w:r>
+        <w:t>Điều kiện để cosine có nghĩa: q và e phải do cùng một mô hình và cùng một hàm normalize_text sinh ra thì mới nằm chung một không gian 768 chiều. Vì vậy trước khi dùng lại cache, hệ thống kiểm tra _cache_matches_model — nếu bỏ bước này, vector của một mô hình cũ vẫn nạp trót lọt và làm sai âm thầm toàn bộ điểm cosine.</w:t>
+      </w:r>
+    </w:p>
+    <w:p>
+      <w:pPr>
+        <w:spacing w:before="160" w:after="40"/>
+      </w:pPr>
+      <w:r>
+        <w:rPr>
+          <w:b/>
+          <w:sz w:val="20"/>
+        </w:rPr>
+        <w:t>Vị trí: nlp/nlp_engine.py — dòng 904–905</w:t>
+      </w:r>
+    </w:p>
+    <w:p>
+      <w:pPr>
         <w:spacing w:before="40" w:after="120"/>
         <w:ind w:left="280"/>
       </w:pPr>
@@ -126,6 +162,7 @@
           <w:rFonts w:ascii="Consolas" w:hAnsi="Consolas"/>
           <w:sz w:val="16"/>
         </w:rPr>
+        <w:lastRenderedPageBreak/>
         <w:t>848 |         query_embedding = self.model.encode(expanded, convert_to_tensor=True)</w:t>
       </w:r>
       <w:r>
@@ -249,7 +286,6 @@
         <w:pStyle w:val="Heading1"/>
       </w:pPr>
       <w:r>
-        <w:lastRenderedPageBreak/>
         <w:t>B. TÁI XẾP HẠNG</w:t>
       </w:r>
     </w:p>
@@ -471,6 +507,7 @@
           <w:color w:val="000080"/>
           <w:sz w:val="20"/>
         </w:rPr>
+        <w:lastRenderedPageBreak/>
         <w:t>coverage = min(1, |tokens(alias)| / |tokens(q)|)</w:t>
       </w:r>
       <w:r>
@@ -623,13 +660,6 @@
           <w:sz w:val="16"/>
         </w:rPr>
         <w:br/>
-      </w:r>
-      <w:r>
-        <w:rPr>
-          <w:rFonts w:ascii="Consolas" w:hAnsi="Consolas"/>
-          <w:sz w:val="16"/>
-        </w:rPr>
-        <w:lastRenderedPageBreak/>
         <w:t xml:space="preserve">730 | </w:t>
       </w:r>
       <w:r>
@@ -873,7 +903,11 @@
         <w:spacing w:after="80"/>
       </w:pPr>
       <w:r>
-        <w:t>Đây là thành phần quan trọng nhất của tầng tái xếp hạng. SBERT chỉ đo tương đồng nên KHÔNG phân biệt được “phụ thuộc insuline” (E10) với “không phụ thuộc insuline” (E11) — hai chuỗi gần như giống hệt nhau. Hình phạt đặt lớn hơn phần thưởng nhiều lần vì mã hóa sai típ bệnh là lỗi lâm sàng nghiêm trọng. Trục vỡ–không vỡ mang mức phạt cao nhất (0,20) vì phình động mạch vỡ là cấp cứu ngoại khoa còn chưa vỡ là theo dõi định kỳ — cùng vị trí giải phẫu nhưng hai hướng xử trí khác hẳn.</w:t>
+        <w:t xml:space="preserve">Đây là thành phần quan trọng nhất của tầng tái xếp hạng. SBERT chỉ đo tương đồng nên KHÔNG phân biệt được “phụ thuộc insuline” (E10) với “không phụ thuộc insuline” (E11) — hai </w:t>
+      </w:r>
+      <w:r>
+        <w:lastRenderedPageBreak/>
+        <w:t>chuỗi gần như giống hệt nhau. Hình phạt đặt lớn hơn phần thưởng nhiều lần vì mã hóa sai típ bệnh là lỗi lâm sàng nghiêm trọng. Trục vỡ–không vỡ mang mức phạt cao nhất (0,20) vì phình động mạch vỡ là cấp cứu ngoại khoa còn chưa vỡ là theo dõi định kỳ — cùng vị trí giải phẫu nhưng hai hướng xử trí khác hẳn.</w:t>
       </w:r>
     </w:p>
     <w:p>
@@ -1018,7 +1052,6 @@
         <w:pStyle w:val="Heading2"/>
       </w:pPr>
       <w:r>
-        <w:lastRenderedPageBreak/>
         <w:t>6. Điểm mức chi tiết của mã</w:t>
       </w:r>
     </w:p>
@@ -1261,6 +1294,13 @@
           <w:sz w:val="16"/>
         </w:rPr>
         <w:br/>
+      </w:r>
+      <w:r>
+        <w:rPr>
+          <w:rFonts w:ascii="Consolas" w:hAnsi="Consolas"/>
+          <w:sz w:val="16"/>
+        </w:rPr>
+        <w:lastRenderedPageBreak/>
         <w:t>703 |             if query_is_unqualified:</w:t>
       </w:r>
       <w:r>
@@ -1464,7 +1504,6 @@
           <w:b/>
           <w:sz w:val="20"/>
         </w:rPr>
-        <w:lastRenderedPageBreak/>
         <w:t>Vị trí: nlp/nlp_engine.py — dòng 744–752</w:t>
       </w:r>
     </w:p>
@@ -1570,22 +1609,709 @@
         <w:spacing w:before="40" w:after="120"/>
         <w:ind w:left="280"/>
       </w:pPr>
+      <m:oMathPara>
+        <m:oMath>
+          <m:r>
+            <w:rPr>
+              <w:rFonts w:ascii="Cambria Math" w:hAnsi="Cambria Math"/>
+              <w:color w:val="000080"/>
+              <w:sz w:val="20"/>
+            </w:rPr>
+            <m:t>score</m:t>
+          </m:r>
+          <m:d>
+            <m:dPr>
+              <m:ctrlPr>
+                <w:rPr>
+                  <w:rFonts w:ascii="Cambria Math" w:hAnsi="Cambria Math"/>
+                  <w:color w:val="000080"/>
+                  <w:sz w:val="20"/>
+                </w:rPr>
+              </m:ctrlPr>
+            </m:dPr>
+            <m:e>
+              <m:r>
+                <w:rPr>
+                  <w:rFonts w:ascii="Cambria Math" w:hAnsi="Cambria Math"/>
+                  <w:color w:val="000080"/>
+                  <w:sz w:val="20"/>
+                </w:rPr>
+                <m:t>c</m:t>
+              </m:r>
+            </m:e>
+          </m:d>
+          <m:r>
+            <w:rPr>
+              <w:rFonts w:ascii="Cambria Math" w:hAnsi="Cambria Math"/>
+              <w:color w:val="000080"/>
+              <w:sz w:val="20"/>
+            </w:rPr>
+            <m:t>=</m:t>
+          </m:r>
+          <m:func>
+            <m:funcPr>
+              <m:ctrlPr>
+                <w:rPr>
+                  <w:rFonts w:ascii="Cambria Math" w:hAnsi="Cambria Math"/>
+                  <w:color w:val="000080"/>
+                  <w:sz w:val="20"/>
+                </w:rPr>
+              </m:ctrlPr>
+            </m:funcPr>
+            <m:fName>
+              <m:limLow>
+                <m:limLowPr>
+                  <m:ctrlPr>
+                    <w:rPr>
+                      <w:rFonts w:ascii="Cambria Math" w:hAnsi="Cambria Math"/>
+                      <w:color w:val="000080"/>
+                      <w:sz w:val="20"/>
+                    </w:rPr>
+                  </m:ctrlPr>
+                </m:limLowPr>
+                <m:e>
+                  <m:r>
+                    <m:rPr>
+                      <m:sty m:val="p"/>
+                    </m:rPr>
+                    <w:rPr>
+                      <w:rFonts w:ascii="Cambria Math" w:hAnsi="Cambria Math"/>
+                      <w:color w:val="000080"/>
+                      <w:sz w:val="20"/>
+                    </w:rPr>
+                    <m:t>max</m:t>
+                  </m:r>
+                </m:e>
+                <m:lim>
+                  <m:r>
+                    <w:rPr>
+                      <w:rFonts w:ascii="Cambria Math" w:hAnsi="Cambria Math"/>
+                      <w:color w:val="000080"/>
+                      <w:sz w:val="20"/>
+                    </w:rPr>
+                    <m:t>e∈E</m:t>
+                  </m:r>
+                  <m:d>
+                    <m:dPr>
+                      <m:ctrlPr>
+                        <w:rPr>
+                          <w:rFonts w:ascii="Cambria Math" w:hAnsi="Cambria Math"/>
+                          <w:color w:val="000080"/>
+                          <w:sz w:val="20"/>
+                        </w:rPr>
+                      </m:ctrlPr>
+                    </m:dPr>
+                    <m:e>
+                      <m:r>
+                        <w:rPr>
+                          <w:rFonts w:ascii="Cambria Math" w:hAnsi="Cambria Math"/>
+                          <w:color w:val="000080"/>
+                          <w:sz w:val="20"/>
+                        </w:rPr>
+                        <m:t>c</m:t>
+                      </m:r>
+                    </m:e>
+                  </m:d>
+                </m:lim>
+              </m:limLow>
+            </m:fName>
+            <m:e>
+              <m:r>
+                <w:rPr>
+                  <w:rFonts w:ascii="Cambria Math" w:hAnsi="Cambria Math"/>
+                  <w:color w:val="000080"/>
+                  <w:sz w:val="20"/>
+                </w:rPr>
+                <m:t xml:space="preserve">   </m:t>
+              </m:r>
+              <m:d>
+                <m:dPr>
+                  <m:begChr m:val="["/>
+                  <m:endChr m:val="]"/>
+                  <m:ctrlPr>
+                    <w:rPr>
+                      <w:rFonts w:ascii="Cambria Math" w:hAnsi="Cambria Math"/>
+                      <w:color w:val="000080"/>
+                      <w:sz w:val="20"/>
+                    </w:rPr>
+                  </m:ctrlPr>
+                </m:dPr>
+                <m:e>
+                  <m:func>
+                    <m:funcPr>
+                      <m:ctrlPr>
+                        <w:rPr>
+                          <w:rFonts w:ascii="Cambria Math" w:hAnsi="Cambria Math"/>
+                          <w:color w:val="000080"/>
+                          <w:sz w:val="20"/>
+                        </w:rPr>
+                      </m:ctrlPr>
+                    </m:funcPr>
+                    <m:fName>
+                      <m:r>
+                        <m:rPr>
+                          <m:sty m:val="p"/>
+                        </m:rPr>
+                        <w:rPr>
+                          <w:rFonts w:ascii="Cambria Math" w:hAnsi="Cambria Math"/>
+                          <w:color w:val="000080"/>
+                          <w:sz w:val="20"/>
+                        </w:rPr>
+                        <m:t>cos</m:t>
+                      </m:r>
+                    </m:fName>
+                    <m:e>
+                      <m:d>
+                        <m:dPr>
+                          <m:ctrlPr>
+                            <w:rPr>
+                              <w:rFonts w:ascii="Cambria Math" w:hAnsi="Cambria Math"/>
+                              <w:color w:val="000080"/>
+                              <w:sz w:val="20"/>
+                            </w:rPr>
+                          </m:ctrlPr>
+                        </m:dPr>
+                        <m:e>
+                          <m:r>
+                            <w:rPr>
+                              <w:rFonts w:ascii="Cambria Math" w:hAnsi="Cambria Math"/>
+                              <w:color w:val="000080"/>
+                              <w:sz w:val="20"/>
+                            </w:rPr>
+                            <m:t>q,e</m:t>
+                          </m:r>
+                        </m:e>
+                      </m:d>
+                    </m:e>
+                  </m:func>
+                  <m:r>
+                    <w:rPr>
+                      <w:rFonts w:ascii="Cambria Math" w:hAnsi="Cambria Math"/>
+                      <w:color w:val="000080"/>
+                      <w:sz w:val="20"/>
+                    </w:rPr>
+                    <m:t>+0,12×F1</m:t>
+                  </m:r>
+                  <m:d>
+                    <m:dPr>
+                      <m:ctrlPr>
+                        <w:rPr>
+                          <w:rFonts w:ascii="Cambria Math" w:hAnsi="Cambria Math"/>
+                          <w:color w:val="000080"/>
+                          <w:sz w:val="20"/>
+                        </w:rPr>
+                      </m:ctrlPr>
+                    </m:dPr>
+                    <m:e>
+                      <m:r>
+                        <w:rPr>
+                          <w:rFonts w:ascii="Cambria Math" w:hAnsi="Cambria Math"/>
+                          <w:color w:val="000080"/>
+                          <w:sz w:val="20"/>
+                        </w:rPr>
+                        <m:t>q,e</m:t>
+                      </m:r>
+                    </m:e>
+                  </m:d>
+                  <m:r>
+                    <w:rPr>
+                      <w:rFonts w:ascii="Cambria Math" w:hAnsi="Cambria Math"/>
+                      <w:color w:val="000080"/>
+                      <w:sz w:val="20"/>
+                    </w:rPr>
+                    <m:t>+0,10×</m:t>
+                  </m:r>
+                  <m:sSub>
+                    <m:sSubPr>
+                      <m:ctrlPr>
+                        <w:rPr>
+                          <w:rFonts w:ascii="Cambria Math" w:hAnsi="Cambria Math"/>
+                          <w:color w:val="000080"/>
+                          <w:sz w:val="20"/>
+                        </w:rPr>
+                      </m:ctrlPr>
+                    </m:sSubPr>
+                    <m:e>
+                      <m:r>
+                        <m:rPr>
+                          <m:sty m:val="p"/>
+                        </m:rPr>
+                        <w:rPr>
+                          <w:rFonts w:ascii="Cambria Math" w:hAnsi="Cambria Math"/>
+                          <w:color w:val="000080"/>
+                          <w:sz w:val="20"/>
+                        </w:rPr>
+                        <m:t>1</m:t>
+                      </m:r>
+                    </m:e>
+                    <m:sub>
+                      <m:d>
+                        <m:dPr>
+                          <m:begChr m:val="{"/>
+                          <m:endChr m:val="}"/>
+                          <m:ctrlPr>
+                            <w:rPr>
+                              <w:rFonts w:ascii="Cambria Math" w:hAnsi="Cambria Math"/>
+                              <w:color w:val="000080"/>
+                              <w:sz w:val="20"/>
+                            </w:rPr>
+                          </m:ctrlPr>
+                        </m:dPr>
+                        <m:e>
+                          <m:r>
+                            <w:rPr>
+                              <w:rFonts w:ascii="Cambria Math" w:hAnsi="Cambria Math"/>
+                              <w:color w:val="000080"/>
+                              <w:sz w:val="20"/>
+                            </w:rPr>
+                            <m:t>e</m:t>
+                          </m:r>
+                          <m:r>
+                            <m:rPr>
+                              <m:nor/>
+                            </m:rPr>
+                            <w:rPr>
+                              <w:rFonts w:ascii="Cambria Math" w:hAnsi="Cambria Math"/>
+                              <w:color w:val="000080"/>
+                              <w:sz w:val="20"/>
+                            </w:rPr>
+                            <m:t> nằm trọn trong </m:t>
+                          </m:r>
+                          <m:r>
+                            <w:rPr>
+                              <w:rFonts w:ascii="Cambria Math" w:hAnsi="Cambria Math"/>
+                              <w:color w:val="000080"/>
+                              <w:sz w:val="20"/>
+                            </w:rPr>
+                            <m:t>q</m:t>
+                          </m:r>
+                        </m:e>
+                      </m:d>
+                    </m:sub>
+                  </m:sSub>
+                  <m:r>
+                    <w:rPr>
+                      <w:rFonts w:ascii="Cambria Math" w:hAnsi="Cambria Math"/>
+                      <w:color w:val="000080"/>
+                      <w:sz w:val="20"/>
+                    </w:rPr>
+                    <m:t>+boost</m:t>
+                  </m:r>
+                  <m:d>
+                    <m:dPr>
+                      <m:ctrlPr>
+                        <w:rPr>
+                          <w:rFonts w:ascii="Cambria Math" w:hAnsi="Cambria Math"/>
+                          <w:color w:val="000080"/>
+                          <w:sz w:val="20"/>
+                        </w:rPr>
+                      </m:ctrlPr>
+                    </m:dPr>
+                    <m:e>
+                      <m:r>
+                        <w:rPr>
+                          <w:rFonts w:ascii="Cambria Math" w:hAnsi="Cambria Math"/>
+                          <w:color w:val="000080"/>
+                          <w:sz w:val="20"/>
+                        </w:rPr>
+                        <m:t>c</m:t>
+                      </m:r>
+                    </m:e>
+                  </m:d>
+                  <m:r>
+                    <w:rPr>
+                      <w:rFonts w:ascii="Cambria Math" w:hAnsi="Cambria Math"/>
+                      <w:color w:val="000080"/>
+                      <w:sz w:val="20"/>
+                    </w:rPr>
+                    <m:t>+đối_lập</m:t>
+                  </m:r>
+                  <m:d>
+                    <m:dPr>
+                      <m:ctrlPr>
+                        <w:rPr>
+                          <w:rFonts w:ascii="Cambria Math" w:hAnsi="Cambria Math"/>
+                          <w:color w:val="000080"/>
+                          <w:sz w:val="20"/>
+                        </w:rPr>
+                      </m:ctrlPr>
+                    </m:dPr>
+                    <m:e>
+                      <m:r>
+                        <w:rPr>
+                          <w:rFonts w:ascii="Cambria Math" w:hAnsi="Cambria Math"/>
+                          <w:color w:val="000080"/>
+                          <w:sz w:val="20"/>
+                        </w:rPr>
+                        <m:t>q,c</m:t>
+                      </m:r>
+                    </m:e>
+                  </m:d>
+                  <m:r>
+                    <w:rPr>
+                      <w:rFonts w:ascii="Cambria Math" w:hAnsi="Cambria Math"/>
+                      <w:color w:val="000080"/>
+                      <w:sz w:val="20"/>
+                    </w:rPr>
+                    <m:t>+chi_tiết</m:t>
+                  </m:r>
+                  <m:d>
+                    <m:dPr>
+                      <m:ctrlPr>
+                        <w:rPr>
+                          <w:rFonts w:ascii="Cambria Math" w:hAnsi="Cambria Math"/>
+                          <w:color w:val="000080"/>
+                          <w:sz w:val="20"/>
+                        </w:rPr>
+                      </m:ctrlPr>
+                    </m:dPr>
+                    <m:e>
+                      <m:r>
+                        <w:rPr>
+                          <w:rFonts w:ascii="Cambria Math" w:hAnsi="Cambria Math"/>
+                          <w:color w:val="000080"/>
+                          <w:sz w:val="20"/>
+                        </w:rPr>
+                        <m:t>q,e</m:t>
+                      </m:r>
+                    </m:e>
+                  </m:d>
+                  <m:r>
+                    <w:rPr>
+                      <w:rFonts w:ascii="Cambria Math" w:hAnsi="Cambria Math"/>
+                      <w:color w:val="000080"/>
+                      <w:sz w:val="20"/>
+                    </w:rPr>
+                    <m:t>+cổng</m:t>
+                  </m:r>
+                  <m:d>
+                    <m:dPr>
+                      <m:ctrlPr>
+                        <w:rPr>
+                          <w:rFonts w:ascii="Cambria Math" w:hAnsi="Cambria Math"/>
+                          <w:color w:val="000080"/>
+                          <w:sz w:val="20"/>
+                        </w:rPr>
+                      </m:ctrlPr>
+                    </m:dPr>
+                    <m:e>
+                      <m:r>
+                        <w:rPr>
+                          <w:rFonts w:ascii="Cambria Math" w:hAnsi="Cambria Math"/>
+                          <w:color w:val="000080"/>
+                          <w:sz w:val="20"/>
+                        </w:rPr>
+                        <m:t>q,c</m:t>
+                      </m:r>
+                    </m:e>
+                  </m:d>
+                </m:e>
+              </m:d>
+            </m:e>
+          </m:func>
+          <m:r>
+            <w:rPr>
+              <w:rFonts w:ascii="Consolas" w:hAnsi="Consolas"/>
+              <w:color w:val="000080"/>
+              <w:sz w:val="20"/>
+            </w:rPr>
+            <w:br/>
+          </m:r>
+        </m:oMath>
+      </m:oMathPara>
       <w:r>
         <w:rPr>
           <w:rFonts w:ascii="Consolas" w:hAnsi="Consolas"/>
           <w:color w:val="000080"/>
           <w:sz w:val="20"/>
         </w:rPr>
-        <w:t>score(c) = max      [ cos(q,e)</w:t>
-      </w:r>
+        <w:t>E(c) : tập mục từ của mã c (tên VI, tên EN, synonym, alias)</w:t>
+      </w:r>
+    </w:p>
+    <w:p>
+      <w:pPr>
+        <w:spacing w:before="160" w:after="40"/>
+      </w:pPr>
+      <w:r>
+        <w:rPr>
+          <w:b/>
+          <w:sz w:val="20"/>
+        </w:rPr>
+        <w:t>Giải thích</w:t>
+      </w:r>
+    </w:p>
+    <w:p>
+      <w:pPr>
+        <w:spacing w:after="80"/>
+      </w:pPr>
+      <w:r>
+        <w:t>Công thức trung tâm của toàn dự án. Chênh lệch cosine giữa các mã ICD-10 lân cận chỉ 0,005–0,03, nên các trọng số được đặt đủ lớn để một vi phạm ngữ nghĩa lật được thứ hạng. Lấy max trên mọi mục từ của mã: mã trúng ở bất kỳ cách gọi nào cũng được tính điểm cao nhất của cách gọi đó.</w:t>
+      </w:r>
+    </w:p>
+    <w:p>
+      <w:pPr>
+        <w:spacing w:before="160" w:after="40"/>
+      </w:pPr>
+      <w:r>
+        <w:rPr>
+          <w:b/>
+          <w:sz w:val="20"/>
+        </w:rPr>
+        <w:t>Vị trí: nlp/nlp_engine.py — dòng 922–946</w:t>
+      </w:r>
+    </w:p>
+    <w:p>
+      <w:pPr>
+        <w:spacing w:before="40" w:after="120"/>
+        <w:ind w:left="280"/>
+      </w:pPr>
+      <w:r>
+        <w:rPr>
+          <w:rFonts w:ascii="Consolas" w:hAnsi="Consolas"/>
+          <w:sz w:val="16"/>
+        </w:rPr>
+        <w:t>866 |             score = float(cos_scores[idx])</w:t>
+      </w:r>
+      <w:r>
+        <w:rPr>
+          <w:rFonts w:ascii="Consolas" w:hAnsi="Consolas"/>
+          <w:sz w:val="16"/>
+        </w:rPr>
+        <w:br/>
+        <w:t>867 |             notes: List[str] = []</w:t>
+      </w:r>
+      <w:r>
+        <w:rPr>
+          <w:rFonts w:ascii="Consolas" w:hAnsi="Consolas"/>
+          <w:sz w:val="16"/>
+        </w:rPr>
+        <w:br/>
+        <w:t xml:space="preserve">868 | </w:t>
+      </w:r>
+      <w:r>
+        <w:rPr>
+          <w:rFonts w:ascii="Consolas" w:hAnsi="Consolas"/>
+          <w:sz w:val="16"/>
+        </w:rPr>
+        <w:br/>
+        <w:t>869 |             score += W_LEXICAL * self._lexical_f1(q_tokens, self._entry_tokens[idx])</w:t>
+      </w:r>
+      <w:r>
+        <w:rPr>
+          <w:rFonts w:ascii="Consolas" w:hAnsi="Consolas"/>
+          <w:sz w:val="16"/>
+        </w:rPr>
+        <w:br/>
+        <w:t xml:space="preserve">870 | </w:t>
+      </w:r>
+      <w:r>
+        <w:rPr>
+          <w:rFonts w:ascii="Consolas" w:hAnsi="Consolas"/>
+          <w:sz w:val="16"/>
+        </w:rPr>
+        <w:br/>
+        <w:t>871 |             entry_norm = self._entry_norm[idx]</w:t>
+      </w:r>
+      <w:r>
+        <w:rPr>
+          <w:rFonts w:ascii="Consolas" w:hAnsi="Consolas"/>
+          <w:sz w:val="16"/>
+        </w:rPr>
+        <w:br/>
+      </w:r>
+      <w:r>
+        <w:rPr>
+          <w:rFonts w:ascii="Consolas" w:hAnsi="Consolas"/>
+          <w:sz w:val="16"/>
+        </w:rPr>
+        <w:lastRenderedPageBreak/>
+        <w:t>872 |             if entry_norm and len(entry_norm) &gt;= 5 and entry_norm in expanded:</w:t>
+      </w:r>
+      <w:r>
+        <w:rPr>
+          <w:rFonts w:ascii="Consolas" w:hAnsi="Consolas"/>
+          <w:sz w:val="16"/>
+        </w:rPr>
+        <w:br/>
+        <w:t>873 |                 score += W_EXACT</w:t>
+      </w:r>
+      <w:r>
+        <w:rPr>
+          <w:rFonts w:ascii="Consolas" w:hAnsi="Consolas"/>
+          <w:sz w:val="16"/>
+        </w:rPr>
+        <w:br/>
+        <w:t>874 |                 notes.append(f"khớp trọn cụm '{entry_norm}'")</w:t>
+      </w:r>
+      <w:r>
+        <w:rPr>
+          <w:rFonts w:ascii="Consolas" w:hAnsi="Consolas"/>
+          <w:sz w:val="16"/>
+        </w:rPr>
+        <w:br/>
+        <w:t xml:space="preserve">875 | </w:t>
+      </w:r>
+      <w:r>
+        <w:rPr>
+          <w:rFonts w:ascii="Consolas" w:hAnsi="Consolas"/>
+          <w:sz w:val="16"/>
+        </w:rPr>
+        <w:br/>
+        <w:t>876 |             if code in alias_boosts:</w:t>
+      </w:r>
+      <w:r>
+        <w:rPr>
+          <w:rFonts w:ascii="Consolas" w:hAnsi="Consolas"/>
+          <w:sz w:val="16"/>
+        </w:rPr>
+        <w:br/>
+        <w:t>877 |                 score += alias_boosts[code]</w:t>
+      </w:r>
+      <w:r>
+        <w:rPr>
+          <w:rFonts w:ascii="Consolas" w:hAnsi="Consolas"/>
+          <w:sz w:val="16"/>
+        </w:rPr>
+        <w:br/>
+        <w:t>878 |                 notes.append("khớp alias lâm sàng đã kiểm chứng")</w:t>
+      </w:r>
+      <w:r>
+        <w:rPr>
+          <w:rFonts w:ascii="Consolas" w:hAnsi="Consolas"/>
+          <w:sz w:val="16"/>
+        </w:rPr>
+        <w:br/>
+        <w:t xml:space="preserve">879 | </w:t>
+      </w:r>
+      <w:r>
+        <w:rPr>
+          <w:rFonts w:ascii="Consolas" w:hAnsi="Consolas"/>
+          <w:sz w:val="16"/>
+        </w:rPr>
+        <w:br/>
+        <w:t>880 |             polarity_delta, polarity_notes = self._polarity_delta(q_labels, code)</w:t>
+      </w:r>
+      <w:r>
+        <w:rPr>
+          <w:rFonts w:ascii="Consolas" w:hAnsi="Consolas"/>
+          <w:sz w:val="16"/>
+        </w:rPr>
+        <w:br/>
+        <w:t>881 |             score += polarity_delta</w:t>
+      </w:r>
+      <w:r>
+        <w:rPr>
+          <w:rFonts w:ascii="Consolas" w:hAnsi="Consolas"/>
+          <w:sz w:val="16"/>
+        </w:rPr>
+        <w:br/>
+        <w:t>882 |             notes.extend(polarity_notes)</w:t>
+      </w:r>
+      <w:r>
+        <w:rPr>
+          <w:rFonts w:ascii="Consolas" w:hAnsi="Consolas"/>
+          <w:sz w:val="16"/>
+        </w:rPr>
+        <w:br/>
+        <w:t xml:space="preserve">883 | </w:t>
+      </w:r>
+      <w:r>
+        <w:rPr>
+          <w:rFonts w:ascii="Consolas" w:hAnsi="Consolas"/>
+          <w:sz w:val="16"/>
+        </w:rPr>
+        <w:br/>
+        <w:t>884 |             spec_delta, spec_notes = self._specificity_delta(</w:t>
+      </w:r>
+      <w:r>
+        <w:rPr>
+          <w:rFonts w:ascii="Consolas" w:hAnsi="Consolas"/>
+          <w:sz w:val="16"/>
+        </w:rPr>
+        <w:br/>
+        <w:t>885 |                 q_tokens, entry_norm, self._entry_tokens[idx])</w:t>
+      </w:r>
+      <w:r>
+        <w:rPr>
+          <w:rFonts w:ascii="Consolas" w:hAnsi="Consolas"/>
+          <w:sz w:val="16"/>
+        </w:rPr>
+        <w:br/>
+        <w:t>886 |             score += spec_delta</w:t>
+      </w:r>
+      <w:r>
+        <w:rPr>
+          <w:rFonts w:ascii="Consolas" w:hAnsi="Consolas"/>
+          <w:sz w:val="16"/>
+        </w:rPr>
+        <w:br/>
+        <w:t>887 |             notes.extend(spec_notes)</w:t>
+      </w:r>
+      <w:r>
+        <w:rPr>
+          <w:rFonts w:ascii="Consolas" w:hAnsi="Consolas"/>
+          <w:sz w:val="16"/>
+        </w:rPr>
+        <w:br/>
+        <w:t xml:space="preserve">888 | </w:t>
+      </w:r>
+      <w:r>
+        <w:rPr>
+          <w:rFonts w:ascii="Consolas" w:hAnsi="Consolas"/>
+          <w:sz w:val="16"/>
+        </w:rPr>
+        <w:br/>
+        <w:t>889 |             chapter_delta, chapter_notes = self._chapter_delta(expanded, code)</w:t>
+      </w:r>
+      <w:r>
+        <w:rPr>
+          <w:rFonts w:ascii="Consolas" w:hAnsi="Consolas"/>
+          <w:sz w:val="16"/>
+        </w:rPr>
+        <w:br/>
+        <w:t>890 |             score += chapter_delta</w:t>
+      </w:r>
+    </w:p>
+    <w:p>
+      <w:pPr>
+        <w:pStyle w:val="Heading1"/>
+      </w:pPr>
+      <w:r>
+        <w:t>C. HIỆU CHUẨN ĐỘ TIN CẬY</w:t>
+      </w:r>
+    </w:p>
+    <w:p>
+      <w:pPr>
+        <w:pStyle w:val="Heading2"/>
+      </w:pPr>
+      <w:r>
+        <w:t>9. Softmax có nhiệt độ</w:t>
+      </w:r>
+    </w:p>
+    <w:p>
+      <w:pPr>
+        <w:spacing w:before="160" w:after="40"/>
+      </w:pPr>
+      <w:r>
+        <w:rPr>
+          <w:b/>
+          <w:sz w:val="20"/>
+        </w:rPr>
+        <w:t>Công thức</w:t>
+      </w:r>
+    </w:p>
+    <w:p>
+      <w:pPr>
+        <w:spacing w:before="40" w:after="120"/>
+        <w:ind w:left="280"/>
+      </w:pPr>
       <w:r>
         <w:rPr>
           <w:rFonts w:ascii="Consolas" w:hAnsi="Consolas"/>
           <w:color w:val="000080"/>
           <w:sz w:val="20"/>
         </w:rPr>
-        <w:br/>
-        <w:t xml:space="preserve">           e ∈ E(c)   + 0,12 × F1(q,e)</w:t>
+        <w:t>p_i = exp((s_i − s_max) / T) / Σ_j exp((s_j − s_max) / T)</w:t>
       </w:r>
       <w:r>
         <w:rPr>
@@ -1594,7 +2320,6 @@
           <w:sz w:val="20"/>
         </w:rPr>
         <w:br/>
-        <w:t xml:space="preserve">                      + 0,10 × 1{e nằm trọn trong q}</w:t>
       </w:r>
       <w:r>
         <w:rPr>
@@ -1603,7 +2328,7 @@
           <w:sz w:val="20"/>
         </w:rPr>
         <w:br/>
-        <w:t xml:space="preserve">                      + boost(c)</w:t>
+        <w:t>T = 0,06 (nhiệt độ)</w:t>
       </w:r>
       <w:r>
         <w:rPr>
@@ -1612,25 +2337,139 @@
           <w:sz w:val="20"/>
         </w:rPr>
         <w:br/>
-        <w:t xml:space="preserve">                      + đối_lập(q,c)</w:t>
-      </w:r>
-      <w:r>
+        <w:t>j chạy trên 20 mã dẫn đầu theo score</w:t>
+      </w:r>
+    </w:p>
+    <w:p>
+      <w:pPr>
+        <w:spacing w:before="160" w:after="40"/>
+      </w:pPr>
+      <w:r>
+        <w:rPr>
+          <w:b/>
+          <w:sz w:val="20"/>
+        </w:rPr>
+        <w:t>Giải thích</w:t>
+      </w:r>
+    </w:p>
+    <w:p>
+      <w:pPr>
+        <w:spacing w:after="80"/>
+      </w:pPr>
+      <w:r>
+        <w:t>Chuẩn hóa điểm tái xếp hạng thành xác suất tương đối, đo mức áp đảo của mã dẫn đầu so với các ứng viên còn lại. Trừ s_max là thủ thuật ổn định số học tránh tràn số ở hàm exp. Nhiệt độ nhỏ làm phân bố nhọn: chênh 0,1 điểm đủ tạo cách biệt xác suất lớn.</w:t>
+      </w:r>
+    </w:p>
+    <w:p>
+      <w:pPr>
+        <w:spacing w:before="160" w:after="40"/>
+      </w:pPr>
+      <w:r>
+        <w:rPr>
+          <w:b/>
+          <w:sz w:val="20"/>
+        </w:rPr>
+        <w:t>Vị trí: nlp/nlp_engine.py — dòng 968–974</w:t>
+      </w:r>
+    </w:p>
+    <w:p>
+      <w:pPr>
+        <w:spacing w:before="40" w:after="120"/>
+        <w:ind w:left="280"/>
+      </w:pPr>
+      <w:r>
+        <w:rPr>
+          <w:rFonts w:ascii="Consolas" w:hAnsi="Consolas"/>
+          <w:sz w:val="16"/>
+        </w:rPr>
+        <w:t>906 |         scope = ranked[:SOFTMAX_SCOPE]</w:t>
+      </w:r>
+      <w:r>
+        <w:rPr>
+          <w:rFonts w:ascii="Consolas" w:hAnsi="Consolas"/>
+          <w:sz w:val="16"/>
+        </w:rPr>
+        <w:br/>
+        <w:t>907 |         probs: List[float] = []</w:t>
+      </w:r>
+      <w:r>
+        <w:rPr>
+          <w:rFonts w:ascii="Consolas" w:hAnsi="Consolas"/>
+          <w:sz w:val="16"/>
+        </w:rPr>
+        <w:br/>
+        <w:t>908 |         block_mass: Dict[str, float] = {}</w:t>
+      </w:r>
+      <w:r>
+        <w:rPr>
+          <w:rFonts w:ascii="Consolas" w:hAnsi="Consolas"/>
+          <w:sz w:val="16"/>
+        </w:rPr>
+        <w:br/>
+        <w:t>909 |         if scope:</w:t>
+      </w:r>
+      <w:r>
+        <w:rPr>
+          <w:rFonts w:ascii="Consolas" w:hAnsi="Consolas"/>
+          <w:sz w:val="16"/>
+        </w:rPr>
+        <w:br/>
+        <w:t>910 |             top_score = scope[0][1]["score"]</w:t>
+      </w:r>
+      <w:r>
+        <w:rPr>
+          <w:rFonts w:ascii="Consolas" w:hAnsi="Consolas"/>
+          <w:sz w:val="16"/>
+        </w:rPr>
+        <w:br/>
+        <w:t>911 |             exps = np.exp([(kv[1]["score"] - top_score) / SOFTMAX_TEMPERATURE for kv in scope])</w:t>
+      </w:r>
+      <w:r>
+        <w:rPr>
+          <w:rFonts w:ascii="Consolas" w:hAnsi="Consolas"/>
+          <w:sz w:val="16"/>
+        </w:rPr>
+        <w:br/>
+        <w:t>912 |             probs = (exps / exps.sum()).tolist()</w:t>
+      </w:r>
+    </w:p>
+    <w:p>
+      <w:pPr>
+        <w:pStyle w:val="Heading2"/>
+      </w:pPr>
+      <w:r>
+        <w:t>10. Gộp khối lượng xác suất theo khối 3 ký tự</w:t>
+      </w:r>
+    </w:p>
+    <w:p>
+      <w:pPr>
+        <w:spacing w:before="160" w:after="40"/>
+      </w:pPr>
+      <w:r>
+        <w:rPr>
+          <w:b/>
+          <w:sz w:val="20"/>
+        </w:rPr>
+        <w:t>Công thức</w:t>
+      </w:r>
+    </w:p>
+    <w:p>
+      <w:pPr>
+        <w:spacing w:before="40" w:after="120"/>
+        <w:ind w:left="280"/>
         <w:rPr>
           <w:rFonts w:ascii="Consolas" w:hAnsi="Consolas"/>
           <w:color w:val="000080"/>
           <w:sz w:val="20"/>
         </w:rPr>
-        <w:br/>
-        <w:t xml:space="preserve">                      + chi_tiết(q,e)</w:t>
-      </w:r>
+      </w:pPr>
       <w:r>
         <w:rPr>
           <w:rFonts w:ascii="Consolas" w:hAnsi="Consolas"/>
           <w:color w:val="000080"/>
           <w:sz w:val="20"/>
         </w:rPr>
-        <w:br/>
-        <w:t xml:space="preserve">                      + cổng(q,c) ]</w:t>
+        <w:t xml:space="preserve">mass(B) = Σ  p_i(c)      </w:t>
       </w:r>
       <w:r>
         <w:rPr>
@@ -1646,8 +2485,33 @@
           <w:color w:val="000080"/>
           <w:sz w:val="20"/>
         </w:rPr>
-        <w:br/>
-        <w:t>E(c) : tập mục từ của mã c (tên VI, tên EN, synonym, alias)</w:t>
+        <w:t>với B là khối 3 ký tự, ví dụ E11 ⊃ {E11, E11.9, E11.1, …}c∈B</w:t>
+      </w:r>
+      <w:r>
+        <w:rPr>
+          <w:rFonts w:ascii="Consolas" w:hAnsi="Consolas"/>
+          <w:color w:val="000080"/>
+          <w:sz w:val="20"/>
+        </w:rPr>
+        <w:br/>
+      </w:r>
+      <w:r>
+        <w:rPr>
+          <w:rFonts w:ascii="Consolas" w:hAnsi="Consolas"/>
+          <w:color w:val="000080"/>
+          <w:sz w:val="20"/>
+        </w:rPr>
+        <w:br/>
+        <w:t>relative(c) = { mass(B(c))  nếu c là mã điểm cao nhất trong khối B(c)</w:t>
+      </w:r>
+      <w:r>
+        <w:rPr>
+          <w:rFonts w:ascii="Consolas" w:hAnsi="Consolas"/>
+          <w:color w:val="000080"/>
+          <w:sz w:val="20"/>
+        </w:rPr>
+        <w:br/>
+        <w:t xml:space="preserve">              { p_i(c)      nếu khối đã có mã khác nhận khối lượng</w:t>
       </w:r>
     </w:p>
     <w:p>
@@ -1659,6 +2523,7 @@
           <w:b/>
           <w:sz w:val="20"/>
         </w:rPr>
+        <w:lastRenderedPageBreak/>
         <w:t>Giải thích</w:t>
       </w:r>
     </w:p>
@@ -1667,7 +2532,7 @@
         <w:spacing w:after="80"/>
       </w:pPr>
       <w:r>
-        <w:t>Công thức trung tâm của toàn dự án. Chênh lệch cosine giữa các mã ICD-10 lân cận chỉ 0,005–0,03, nên các trọng số được đặt đủ lớn để một vi phạm ngữ nghĩa lật được thứ hạng. Lấy max trên mọi mục từ của mã: mã trúng ở bất kỳ cách gọi nào cũng được tính điểm cao nhất của cách gọi đó.</w:t>
+        <w:t>E11 và E11.9 là cùng một chẩn đoán ở hai mức chi tiết. Nếu để chúng chia đôi xác suất thì độ tin cậy bị hạ oan, nên gộp cả khối lại và trao toàn bộ khối lượng cho mã tốt nhất trong khối.</w:t>
       </w:r>
     </w:p>
     <w:p>
@@ -1679,7 +2544,7 @@
           <w:b/>
           <w:sz w:val="20"/>
         </w:rPr>
-        <w:t>Vị trí: nlp/nlp_engine.py — dòng 922–946</w:t>
+        <w:t>Vị trí: nlp/nlp_engine.py — dòng 977–994</w:t>
       </w:r>
     </w:p>
     <w:p>
@@ -1692,226 +2557,266 @@
           <w:rFonts w:ascii="Consolas" w:hAnsi="Consolas"/>
           <w:sz w:val="16"/>
         </w:rPr>
-        <w:t>866 |             score = float(cos_scores[idx])</w:t>
-      </w:r>
-      <w:r>
-        <w:rPr>
-          <w:rFonts w:ascii="Consolas" w:hAnsi="Consolas"/>
-          <w:sz w:val="16"/>
-        </w:rPr>
-        <w:br/>
-        <w:t>867 |             notes: List[str] = []</w:t>
-      </w:r>
-      <w:r>
-        <w:rPr>
-          <w:rFonts w:ascii="Consolas" w:hAnsi="Consolas"/>
-          <w:sz w:val="16"/>
-        </w:rPr>
-        <w:br/>
-        <w:t xml:space="preserve">868 | </w:t>
-      </w:r>
-      <w:r>
-        <w:rPr>
-          <w:rFonts w:ascii="Consolas" w:hAnsi="Consolas"/>
-          <w:sz w:val="16"/>
-        </w:rPr>
-        <w:br/>
-        <w:t>869 |             score += W_LEXICAL * self._lexical_f1(q_tokens, self._entry_tokens[idx])</w:t>
-      </w:r>
-      <w:r>
-        <w:rPr>
-          <w:rFonts w:ascii="Consolas" w:hAnsi="Consolas"/>
-          <w:sz w:val="16"/>
-        </w:rPr>
-        <w:br/>
-        <w:t xml:space="preserve">870 | </w:t>
-      </w:r>
-      <w:r>
-        <w:rPr>
-          <w:rFonts w:ascii="Consolas" w:hAnsi="Consolas"/>
-          <w:sz w:val="16"/>
-        </w:rPr>
-        <w:br/>
-        <w:t>871 |             entry_norm = self._entry_norm[idx]</w:t>
-      </w:r>
-      <w:r>
-        <w:rPr>
-          <w:rFonts w:ascii="Consolas" w:hAnsi="Consolas"/>
-          <w:sz w:val="16"/>
-        </w:rPr>
-        <w:br/>
-        <w:t>872 |             if entry_norm and len(entry_norm) &gt;= 5 and entry_norm in expanded:</w:t>
-      </w:r>
-      <w:r>
-        <w:rPr>
-          <w:rFonts w:ascii="Consolas" w:hAnsi="Consolas"/>
-          <w:sz w:val="16"/>
-        </w:rPr>
-        <w:br/>
-        <w:t>873 |                 score += W_EXACT</w:t>
-      </w:r>
-      <w:r>
-        <w:rPr>
-          <w:rFonts w:ascii="Consolas" w:hAnsi="Consolas"/>
-          <w:sz w:val="16"/>
-        </w:rPr>
-        <w:br/>
-        <w:t>874 |                 notes.append(f"khớp trọn cụm '{entry_norm}'")</w:t>
-      </w:r>
-      <w:r>
-        <w:rPr>
-          <w:rFonts w:ascii="Consolas" w:hAnsi="Consolas"/>
-          <w:sz w:val="16"/>
-        </w:rPr>
-        <w:br/>
-        <w:t xml:space="preserve">875 | </w:t>
-      </w:r>
-      <w:r>
-        <w:rPr>
-          <w:rFonts w:ascii="Consolas" w:hAnsi="Consolas"/>
-          <w:sz w:val="16"/>
-        </w:rPr>
-        <w:br/>
-        <w:t>876 |             if code in alias_boosts:</w:t>
-      </w:r>
-      <w:r>
-        <w:rPr>
-          <w:rFonts w:ascii="Consolas" w:hAnsi="Consolas"/>
-          <w:sz w:val="16"/>
-        </w:rPr>
-        <w:br/>
-        <w:t>877 |                 score += alias_boosts[code]</w:t>
-      </w:r>
-      <w:r>
-        <w:rPr>
-          <w:rFonts w:ascii="Consolas" w:hAnsi="Consolas"/>
-          <w:sz w:val="16"/>
-        </w:rPr>
-        <w:br/>
-        <w:t>878 |                 notes.append("khớp alias lâm sàng đã kiểm chứng")</w:t>
-      </w:r>
-      <w:r>
-        <w:rPr>
-          <w:rFonts w:ascii="Consolas" w:hAnsi="Consolas"/>
-          <w:sz w:val="16"/>
-        </w:rPr>
-        <w:br/>
-        <w:t xml:space="preserve">879 | </w:t>
-      </w:r>
-      <w:r>
-        <w:rPr>
-          <w:rFonts w:ascii="Consolas" w:hAnsi="Consolas"/>
-          <w:sz w:val="16"/>
-        </w:rPr>
-        <w:br/>
-        <w:t>880 |             polarity_delta, polarity_notes = self._polarity_delta(q_labels, code)</w:t>
-      </w:r>
-      <w:r>
-        <w:rPr>
-          <w:rFonts w:ascii="Consolas" w:hAnsi="Consolas"/>
-          <w:sz w:val="16"/>
-        </w:rPr>
-        <w:br/>
-        <w:t>881 |             score += polarity_delta</w:t>
-      </w:r>
-      <w:r>
-        <w:rPr>
-          <w:rFonts w:ascii="Consolas" w:hAnsi="Consolas"/>
-          <w:sz w:val="16"/>
-        </w:rPr>
-        <w:br/>
-        <w:t>882 |             notes.extend(polarity_notes)</w:t>
-      </w:r>
-      <w:r>
-        <w:rPr>
-          <w:rFonts w:ascii="Consolas" w:hAnsi="Consolas"/>
-          <w:sz w:val="16"/>
-        </w:rPr>
-        <w:br/>
-        <w:t xml:space="preserve">883 | </w:t>
-      </w:r>
-      <w:r>
-        <w:rPr>
-          <w:rFonts w:ascii="Consolas" w:hAnsi="Consolas"/>
-          <w:sz w:val="16"/>
-        </w:rPr>
-        <w:br/>
-        <w:t>884 |             spec_delta, spec_notes = self._specificity_delta(</w:t>
-      </w:r>
-      <w:r>
-        <w:rPr>
-          <w:rFonts w:ascii="Consolas" w:hAnsi="Consolas"/>
-          <w:sz w:val="16"/>
-        </w:rPr>
-        <w:br/>
-        <w:t>885 |                 q_tokens, entry_norm, self._entry_tokens[idx])</w:t>
-      </w:r>
-      <w:r>
-        <w:rPr>
-          <w:rFonts w:ascii="Consolas" w:hAnsi="Consolas"/>
-          <w:sz w:val="16"/>
-        </w:rPr>
-        <w:br/>
-        <w:t>886 |             score += spec_delta</w:t>
-      </w:r>
-      <w:r>
-        <w:rPr>
-          <w:rFonts w:ascii="Consolas" w:hAnsi="Consolas"/>
-          <w:sz w:val="16"/>
-        </w:rPr>
-        <w:br/>
-        <w:t>887 |             notes.extend(spec_notes)</w:t>
-      </w:r>
-      <w:r>
-        <w:rPr>
-          <w:rFonts w:ascii="Consolas" w:hAnsi="Consolas"/>
-          <w:sz w:val="16"/>
-        </w:rPr>
-        <w:br/>
-        <w:t xml:space="preserve">888 | </w:t>
-      </w:r>
-      <w:r>
-        <w:rPr>
-          <w:rFonts w:ascii="Consolas" w:hAnsi="Consolas"/>
-          <w:sz w:val="16"/>
-        </w:rPr>
-        <w:br/>
-      </w:r>
-      <w:r>
-        <w:rPr>
-          <w:rFonts w:ascii="Consolas" w:hAnsi="Consolas"/>
-          <w:sz w:val="16"/>
-        </w:rPr>
-        <w:lastRenderedPageBreak/>
-        <w:t>889 |             chapter_delta, chapter_notes = self._chapter_delta(expanded, code)</w:t>
-      </w:r>
-      <w:r>
-        <w:rPr>
-          <w:rFonts w:ascii="Consolas" w:hAnsi="Consolas"/>
-          <w:sz w:val="16"/>
-        </w:rPr>
-        <w:br/>
-        <w:t>890 |             score += chapter_delta</w:t>
+        <w:t>915 |             for (code, _), p in zip(scope, probs):</w:t>
+      </w:r>
+      <w:r>
+        <w:rPr>
+          <w:rFonts w:ascii="Consolas" w:hAnsi="Consolas"/>
+          <w:sz w:val="16"/>
+        </w:rPr>
+        <w:br/>
+        <w:t>916 |                 block_mass[self._block_of(code)] = block_mass.get(self._block_of(code), 0.0) + p</w:t>
+      </w:r>
+      <w:r>
+        <w:rPr>
+          <w:rFonts w:ascii="Consolas" w:hAnsi="Consolas"/>
+          <w:sz w:val="16"/>
+        </w:rPr>
+        <w:br/>
+        <w:t xml:space="preserve">917 | </w:t>
+      </w:r>
+      <w:r>
+        <w:rPr>
+          <w:rFonts w:ascii="Consolas" w:hAnsi="Consolas"/>
+          <w:sz w:val="16"/>
+        </w:rPr>
+        <w:br/>
+        <w:t>918 |         results = []</w:t>
+      </w:r>
+      <w:r>
+        <w:rPr>
+          <w:rFonts w:ascii="Consolas" w:hAnsi="Consolas"/>
+          <w:sz w:val="16"/>
+        </w:rPr>
+        <w:br/>
+        <w:t>919 |         claimed_blocks = set()</w:t>
+      </w:r>
+      <w:r>
+        <w:rPr>
+          <w:rFonts w:ascii="Consolas" w:hAnsi="Consolas"/>
+          <w:sz w:val="16"/>
+        </w:rPr>
+        <w:br/>
+        <w:t>920 |         for rank, (code, info) in enumerate(ranked[:top_k]):</w:t>
+      </w:r>
+      <w:r>
+        <w:rPr>
+          <w:rFonts w:ascii="Consolas" w:hAnsi="Consolas"/>
+          <w:sz w:val="16"/>
+        </w:rPr>
+        <w:br/>
+        <w:t>921 |             db_entry = self.db_index[code]</w:t>
+      </w:r>
+      <w:r>
+        <w:rPr>
+          <w:rFonts w:ascii="Consolas" w:hAnsi="Consolas"/>
+          <w:sz w:val="16"/>
+        </w:rPr>
+        <w:br/>
+        <w:t>922 |             block = self._block_of(code)</w:t>
+      </w:r>
+      <w:r>
+        <w:rPr>
+          <w:rFonts w:ascii="Consolas" w:hAnsi="Consolas"/>
+          <w:sz w:val="16"/>
+        </w:rPr>
+        <w:br/>
+        <w:t>923 |             if rank &lt; len(probs):</w:t>
+      </w:r>
+      <w:r>
+        <w:rPr>
+          <w:rFonts w:ascii="Consolas" w:hAnsi="Consolas"/>
+          <w:sz w:val="16"/>
+        </w:rPr>
+        <w:br/>
+        <w:t>924 |                 # Mã tốt nhất trong khối nhận toàn bộ khối lượng xác suất của khối.</w:t>
+      </w:r>
+      <w:r>
+        <w:rPr>
+          <w:rFonts w:ascii="Consolas" w:hAnsi="Consolas"/>
+          <w:sz w:val="16"/>
+        </w:rPr>
+        <w:br/>
+        <w:t>925 |                 if block in claimed_blocks:</w:t>
+      </w:r>
+      <w:r>
+        <w:rPr>
+          <w:rFonts w:ascii="Consolas" w:hAnsi="Consolas"/>
+          <w:sz w:val="16"/>
+        </w:rPr>
+        <w:br/>
+        <w:t>926 |                     relative = probs[rank]</w:t>
+      </w:r>
+      <w:r>
+        <w:rPr>
+          <w:rFonts w:ascii="Consolas" w:hAnsi="Consolas"/>
+          <w:sz w:val="16"/>
+        </w:rPr>
+        <w:br/>
+        <w:t>927 |                 else:</w:t>
+      </w:r>
+      <w:r>
+        <w:rPr>
+          <w:rFonts w:ascii="Consolas" w:hAnsi="Consolas"/>
+          <w:sz w:val="16"/>
+        </w:rPr>
+        <w:br/>
+        <w:t>928 |                     relative = block_mass.get(block, probs[rank])</w:t>
+      </w:r>
+      <w:r>
+        <w:rPr>
+          <w:rFonts w:ascii="Consolas" w:hAnsi="Consolas"/>
+          <w:sz w:val="16"/>
+        </w:rPr>
+        <w:br/>
+        <w:t>929 |                     claimed_blocks.add(block)</w:t>
+      </w:r>
+      <w:r>
+        <w:rPr>
+          <w:rFonts w:ascii="Consolas" w:hAnsi="Consolas"/>
+          <w:sz w:val="16"/>
+        </w:rPr>
+        <w:br/>
+        <w:t>930 |             else:</w:t>
+      </w:r>
+      <w:r>
+        <w:rPr>
+          <w:rFonts w:ascii="Consolas" w:hAnsi="Consolas"/>
+          <w:sz w:val="16"/>
+        </w:rPr>
+        <w:br/>
+        <w:t>931 |                 relative = 0.0</w:t>
+      </w:r>
+      <w:r>
+        <w:rPr>
+          <w:rFonts w:ascii="Consolas" w:hAnsi="Consolas"/>
+          <w:sz w:val="16"/>
+        </w:rPr>
+        <w:br/>
+        <w:t>932 |             confidence = self._calibrate(relative, info["raw"])</w:t>
       </w:r>
     </w:p>
     <w:p>
       <w:pPr>
-        <w:pStyle w:val="Heading1"/>
-      </w:pPr>
-      <w:r>
-        <w:t>C. HIỆU CHUẨN ĐỘ TIN CẬY</w:t>
+        <w:pStyle w:val="Heading2"/>
+      </w:pPr>
+      <w:r>
+        <w:t>11. Chuẩn hóa min–max, trộn tuyến tính và sàn theo độ phủ</w:t>
       </w:r>
     </w:p>
     <w:p>
       <w:pPr>
-        <w:pStyle w:val="Heading2"/>
-      </w:pPr>
-      <w:r>
-        <w:t>9. Softmax có nhiệt độ</w:t>
+        <w:spacing w:before="160" w:after="40"/>
+      </w:pPr>
+      <w:r>
+        <w:rPr>
+          <w:b/>
+          <w:sz w:val="20"/>
+        </w:rPr>
+        <w:t>Công thức</w:t>
       </w:r>
     </w:p>
     <w:p>
       <w:pPr>
+        <w:spacing w:before="40" w:after="120"/>
+        <w:ind w:left="280"/>
+      </w:pPr>
+      <w:r>
+        <w:rPr>
+          <w:rFonts w:ascii="Consolas" w:hAnsi="Consolas"/>
+          <w:color w:val="000080"/>
+          <w:sz w:val="20"/>
+        </w:rPr>
+        <w:t>absolute = clamp( (cos_raw − 0,40) / (0,90 − 0,40), 0, 1 )</w:t>
+      </w:r>
+      <w:r>
+        <w:rPr>
+          <w:rFonts w:ascii="Consolas" w:hAnsi="Consolas"/>
+          <w:color w:val="000080"/>
+          <w:sz w:val="20"/>
+        </w:rPr>
+        <w:br/>
+      </w:r>
+      <w:r>
+        <w:rPr>
+          <w:rFonts w:ascii="Consolas" w:hAnsi="Consolas"/>
+          <w:color w:val="000080"/>
+          <w:sz w:val="20"/>
+        </w:rPr>
+        <w:br/>
+        <w:t>coverage = |T_q ∩ T_e| / |T_q|          (tỉ lệ từ của câu được tên mã phủ)</w:t>
+      </w:r>
+      <w:r>
+        <w:rPr>
+          <w:rFonts w:ascii="Consolas" w:hAnsi="Consolas"/>
+          <w:color w:val="000080"/>
+          <w:sz w:val="20"/>
+        </w:rPr>
+        <w:br/>
+      </w:r>
+      <w:r>
+        <w:rPr>
+          <w:rFonts w:ascii="Consolas" w:hAnsi="Consolas"/>
+          <w:color w:val="000080"/>
+          <w:sz w:val="20"/>
+        </w:rPr>
+        <w:br/>
+        <w:t>coverage := 0  nếu ∃ trục t : nhãn_e(t) ≠ ∅ ∧ nhãn_q(t) ≠ nhãn_e(t)</w:t>
+      </w:r>
+      <w:r>
+        <w:rPr>
+          <w:rFonts w:ascii="Consolas" w:hAnsi="Consolas"/>
+          <w:color w:val="000080"/>
+          <w:sz w:val="20"/>
+        </w:rPr>
+        <w:br/>
+      </w:r>
+      <w:r>
+        <w:rPr>
+          <w:rFonts w:ascii="Consolas" w:hAnsi="Consolas"/>
+          <w:color w:val="000080"/>
+          <w:sz w:val="20"/>
+        </w:rPr>
+        <w:br/>
+        <w:t>blended  = 0,65 × relative + 0,35 × absolute</w:t>
+      </w:r>
+      <w:r>
+        <w:rPr>
+          <w:rFonts w:ascii="Consolas" w:hAnsi="Consolas"/>
+          <w:color w:val="000080"/>
+          <w:sz w:val="20"/>
+        </w:rPr>
+        <w:br/>
+      </w:r>
+      <w:r>
+        <w:rPr>
+          <w:rFonts w:ascii="Consolas" w:hAnsi="Consolas"/>
+          <w:color w:val="000080"/>
+          <w:sz w:val="20"/>
+        </w:rPr>
+        <w:br/>
+        <w:t>blended  := max(blended; 0,88)  nếu coverage = 1 ∧ cos_raw ≥ 0,90</w:t>
+      </w:r>
+      <w:r>
+        <w:rPr>
+          <w:rFonts w:ascii="Consolas" w:hAnsi="Consolas"/>
+          <w:color w:val="000080"/>
+          <w:sz w:val="20"/>
+        </w:rPr>
+        <w:br/>
+      </w:r>
+      <w:r>
+        <w:rPr>
+          <w:rFonts w:ascii="Consolas" w:hAnsi="Consolas"/>
+          <w:color w:val="000080"/>
+          <w:sz w:val="20"/>
+        </w:rPr>
+        <w:br/>
+        <w:t>tin_cậy  = 100 × clamp( blended, 0, 1 )</w:t>
+      </w:r>
+    </w:p>
+    <w:p>
+      <w:pPr>
         <w:spacing w:before="160" w:after="40"/>
       </w:pPr>
       <w:r>
@@ -1919,21 +2824,196 @@
           <w:b/>
           <w:sz w:val="20"/>
         </w:rPr>
-        <w:t>Công thức</w:t>
+        <w:t>Giải thích</w:t>
       </w:r>
     </w:p>
     <w:p>
       <w:pPr>
+        <w:spacing w:after="80"/>
+      </w:pPr>
+      <w:r>
+        <w:t>Độ tin cậy KHÔNG lấy trực tiếp từ điểm tái xếp hạng: điểm đó có cộng thưởng nên dễ vượt trần và mọi kết quả sẽ hiện 100%, làm mất tác dụng của ngưỡng duyệt. Thay vào đó kết hợp ba thành phần độc lập — relative đo mức áp đảo so với ứng viên khác, absolute đo mức khớp thật với danh mục, coverage đo câu có được tên mã phủ trọn hay không.</w:t>
+      </w:r>
+      <w:r>
+        <w:br/>
+        <w:t xml:space="preserve">Vì sao cần thêm coverage: relative chiếm 65% điểm số nhưng nó đo mức áp đảo chứ không đo mức đúng, nên câu khớp gần tuyệt đối vẫn bị hạ điểm chỉ vì danh mục còn mã lân cận. Đo trên tập kiểm tra độc lập: “bệnh van hai lá do thấp” khớp I05 “Bệnh lý van hai lá do thấp” ở cosine 0,991 — gần như trùng nghĩa hoàn toàn — nhưng chỉ được 56,26% vì các mã van tim khác chia mất xác suất softmax. Gộp khối 3 ký tự (công thức 10) đã xử lý phần anh em cùng mã cha nhưng không xử lý được các khối lân cận về mặt lâm sàng (I05 với I08, I34). Khi câu được phủ trọn và </w:t>
+      </w:r>
+      <w:r>
+        <w:lastRenderedPageBreak/>
+        <w:t>cosine ≥ 0,90 thì đó là khớp trọn nghĩa, đặt sàn 0,88 để yếu tố cạnh tranh không kéo xuống.</w:t>
+      </w:r>
+      <w:r>
+        <w:br/>
+        <w:t>Cổng lọc phủ định là điều kiện bắt buộc kèm theo, vì coverage đếm theo túi từ nên mù với hai kiểu sai nguy hiểm. Một là mã tự khẳng định thêm: câu “phình động mạch chủ bụng” không nói vỡ hay chưa, mã I71.3 “Phình động mạch chủ bụng, vỡ” lại chứa đủ mọi từ của câu. Hai là phủ định gắn sai chỗ: “viêm mũi không dị ứng” và “Viêm mũi dị ứng, không phân loại” dùng chung đúng bấy nhiêu từ, chỉ khác chỗ đặt chữ “không”, mà nghĩa thì ngược hẳn. Nguyên tắc: trục nào tên mã khẳng định thì câu phải khẳng định y hệt — câu im lặng không tính là đồng ý.</w:t>
+      </w:r>
+      <w:r>
+        <w:br/>
+        <w:t>Coverage cũng chặn chiều ngược lại, thứ cosine không chặn nổi: “viêm kết mạc dị ứng” khớp H10.9 “Viêm kết mạc, không đặc hiệu” ở cosine 0,953 nhưng thiếu hẳn hai từ “dị ứng” — đúng phần mang nghĩa phân biệt.</w:t>
+      </w:r>
+      <w:r>
+        <w:br/>
+        <w:t>Hiệu quả đo được trên tập holdout 51 ca: số ca đúng đạt mức tin cậy cao tăng từ 22 lên 25, số ca sai lọt mức cao giữ nguyên 2, độ chính xác trong mức cao tăng từ 91,7% lên 92,6%. Top-1 và Top-3 không đổi — cơ chế này chỉ tác động lên độ tin cậy, không đổi thứ tự xếp hạng.</w:t>
+      </w:r>
+    </w:p>
+    <w:p>
+      <w:pPr>
+        <w:spacing w:before="160" w:after="40"/>
+      </w:pPr>
+      <w:r>
+        <w:rPr>
+          <w:b/>
+          <w:sz w:val="20"/>
+        </w:rPr>
+        <w:t>Vị trí: nlp/nlp_engine.py — dòng 799–827</w:t>
+      </w:r>
+    </w:p>
+    <w:p>
+      <w:pPr>
         <w:spacing w:before="40" w:after="120"/>
         <w:ind w:left="280"/>
       </w:pPr>
       <w:r>
         <w:rPr>
           <w:rFonts w:ascii="Consolas" w:hAnsi="Consolas"/>
+          <w:sz w:val="16"/>
+        </w:rPr>
+        <w:t>799 |     def _calibrate(relative: float, similarity: float, coverage: float = 0.0) -&gt; float:</w:t>
+      </w:r>
+      <w:r>
+        <w:rPr>
+          <w:rFonts w:ascii="Consolas" w:hAnsi="Consolas"/>
+          <w:sz w:val="16"/>
+        </w:rPr>
+        <w:br/>
+        <w:t>822 |         absolute = (similarity - SIM_FLOOR) / (SIM_CEIL - SIM_FLOOR)</w:t>
+      </w:r>
+      <w:r>
+        <w:rPr>
+          <w:rFonts w:ascii="Consolas" w:hAnsi="Consolas"/>
+          <w:sz w:val="16"/>
+        </w:rPr>
+        <w:br/>
+        <w:t>823 |         absolute = max(0.0, min(1.0, absolute))</w:t>
+      </w:r>
+      <w:r>
+        <w:rPr>
+          <w:rFonts w:ascii="Consolas" w:hAnsi="Consolas"/>
+          <w:sz w:val="16"/>
+        </w:rPr>
+        <w:br/>
+        <w:t>824 |         blended = W_RELATIVE * relative + W_ABSOLUTE * absolute</w:t>
+      </w:r>
+      <w:r>
+        <w:rPr>
+          <w:rFonts w:ascii="Consolas" w:hAnsi="Consolas"/>
+          <w:sz w:val="16"/>
+        </w:rPr>
+        <w:br/>
+        <w:t>825 |         if coverage &gt;= COVERAGE_FULL and similarity &gt;= COVERAGE_FLOOR_SIM:</w:t>
+      </w:r>
+      <w:r>
+        <w:rPr>
+          <w:rFonts w:ascii="Consolas" w:hAnsi="Consolas"/>
+          <w:sz w:val="16"/>
+        </w:rPr>
+        <w:br/>
+        <w:t>826 |             blended = max(blended, COVERAGE_FLOOR_CONF)</w:t>
+      </w:r>
+      <w:r>
+        <w:rPr>
+          <w:rFonts w:ascii="Consolas" w:hAnsi="Consolas"/>
+          <w:sz w:val="16"/>
+        </w:rPr>
+        <w:br/>
+        <w:t>827 |         return round(max(0.0, min(1.0, blended)) * 100, 2)</w:t>
+      </w:r>
+      <w:r>
+        <w:rPr>
+          <w:rFonts w:ascii="Consolas" w:hAnsi="Consolas"/>
+          <w:sz w:val="16"/>
+        </w:rPr>
+        <w:br/>
+      </w:r>
+      <w:r>
+        <w:rPr>
+          <w:rFonts w:ascii="Consolas" w:hAnsi="Consolas"/>
+          <w:sz w:val="16"/>
+        </w:rPr>
+        <w:br/>
+        <w:t>951 |             coverage = (len(q_tokens &amp; self._entry_tokens[idx]) / len(q_tokens)</w:t>
+      </w:r>
+      <w:r>
+        <w:rPr>
+          <w:rFonts w:ascii="Consolas" w:hAnsi="Consolas"/>
+          <w:sz w:val="16"/>
+        </w:rPr>
+        <w:br/>
+        <w:t>952 |                         if q_tokens else 0.0)</w:t>
+      </w:r>
+      <w:r>
+        <w:rPr>
+          <w:rFonts w:ascii="Consolas" w:hAnsi="Consolas"/>
+          <w:sz w:val="16"/>
+        </w:rPr>
+        <w:br/>
+      </w:r>
+      <w:r>
+        <w:rPr>
+          <w:rFonts w:ascii="Consolas" w:hAnsi="Consolas"/>
+          <w:sz w:val="16"/>
+        </w:rPr>
+        <w:br/>
+        <w:t>995 |             eligible = (info.get("coverage", 0.0)</w:t>
+      </w:r>
+      <w:r>
+        <w:rPr>
+          <w:rFonts w:ascii="Consolas" w:hAnsi="Consolas"/>
+          <w:sz w:val="16"/>
+        </w:rPr>
+        <w:br/>
+        <w:t>996 |                         if self._polarity_compatible(q_labels, code) else 0.0)</w:t>
+      </w:r>
+      <w:r>
+        <w:rPr>
+          <w:rFonts w:ascii="Consolas" w:hAnsi="Consolas"/>
+          <w:sz w:val="16"/>
+        </w:rPr>
+        <w:br/>
+        <w:t>997 |             confidence = self._calibrate(relative, info["raw"], eligible)</w:t>
+      </w:r>
+    </w:p>
+    <w:p>
+      <w:pPr>
+        <w:pStyle w:val="Heading2"/>
+      </w:pPr>
+      <w:r>
+        <w:t>12. Phân mức độ tin cậy và ánh xạ trạng thái FHIR</w:t>
+      </w:r>
+    </w:p>
+    <w:p>
+      <w:pPr>
+        <w:spacing w:before="160" w:after="40"/>
+      </w:pPr>
+      <w:r>
+        <w:rPr>
+          <w:b/>
+          <w:sz w:val="20"/>
+        </w:rPr>
+        <w:t>Công thức</w:t>
+      </w:r>
+    </w:p>
+    <w:p>
+      <w:pPr>
+        <w:spacing w:before="40" w:after="120"/>
+        <w:ind w:left="280"/>
+      </w:pPr>
+      <w:r>
+        <w:rPr>
+          <w:rFonts w:ascii="Consolas" w:hAnsi="Consolas"/>
           <w:color w:val="000080"/>
           <w:sz w:val="20"/>
         </w:rPr>
-        <w:t>p_i = exp((s_i − s_max) / T) / Σ_j exp((s_j − s_max) / T)</w:t>
+        <w:t>band(x) = { high    nếu x ≥ 85</w:t>
       </w:r>
       <w:r>
         <w:rPr>
@@ -1942,6 +3022,7 @@
           <w:sz w:val="20"/>
         </w:rPr>
         <w:br/>
+        <w:t xml:space="preserve">          { medium  nếu x ≥ 60</w:t>
       </w:r>
       <w:r>
         <w:rPr>
@@ -1950,7 +3031,7 @@
           <w:sz w:val="20"/>
         </w:rPr>
         <w:br/>
-        <w:t>T = 0,06 (nhiệt độ)</w:t>
+        <w:t xml:space="preserve">          { low     nếu x &lt; 60</w:t>
       </w:r>
       <w:r>
         <w:rPr>
@@ -1959,7 +3040,68 @@
           <w:sz w:val="20"/>
         </w:rPr>
         <w:br/>
-        <w:t>j chạy trên 20 mã dẫn đầu theo score</w:t>
+      </w:r>
+      <w:r>
+        <w:rPr>
+          <w:rFonts w:ascii="Consolas" w:hAnsi="Consolas"/>
+          <w:color w:val="000080"/>
+          <w:sz w:val="20"/>
+        </w:rPr>
+        <w:br/>
+        <w:t>verificationStatus = { provisional   nếu x ≥ 85</w:t>
+      </w:r>
+      <w:r>
+        <w:rPr>
+          <w:rFonts w:ascii="Consolas" w:hAnsi="Consolas"/>
+          <w:color w:val="000080"/>
+          <w:sz w:val="20"/>
+        </w:rPr>
+        <w:br/>
+        <w:t xml:space="preserve">                     { differential  nếu x ≥ 60</w:t>
+      </w:r>
+      <w:r>
+        <w:rPr>
+          <w:rFonts w:ascii="Consolas" w:hAnsi="Consolas"/>
+          <w:color w:val="000080"/>
+          <w:sz w:val="20"/>
+        </w:rPr>
+        <w:br/>
+        <w:t xml:space="preserve">                     { unconfirmed   nếu x &lt; 60</w:t>
+      </w:r>
+      <w:r>
+        <w:rPr>
+          <w:rFonts w:ascii="Consolas" w:hAnsi="Consolas"/>
+          <w:color w:val="000080"/>
+          <w:sz w:val="20"/>
+        </w:rPr>
+        <w:br/>
+        <w:t xml:space="preserve">                     { confirmed     chỉ khi có thao tác duyệt của bác sĩ</w:t>
+      </w:r>
+      <w:r>
+        <w:rPr>
+          <w:rFonts w:ascii="Consolas" w:hAnsi="Consolas"/>
+          <w:color w:val="000080"/>
+          <w:sz w:val="20"/>
+        </w:rPr>
+        <w:br/>
+      </w:r>
+      <w:r>
+        <w:rPr>
+          <w:rFonts w:ascii="Consolas" w:hAnsi="Consolas"/>
+          <w:color w:val="000080"/>
+          <w:sz w:val="20"/>
+        </w:rPr>
+        <w:br/>
+        <w:t>requires_review = ( band(x) ≠ high )</w:t>
+      </w:r>
+      <w:r>
+        <w:rPr>
+          <w:rFonts w:ascii="Consolas" w:hAnsi="Consolas"/>
+          <w:color w:val="000080"/>
+          <w:sz w:val="20"/>
+        </w:rPr>
+        <w:br/>
+        <w:t>x &lt; 40 → từ chối sinh tài nguyên FHIR (HTTP 422)</w:t>
       </w:r>
     </w:p>
     <w:p>
@@ -1979,7 +3121,25 @@
         <w:spacing w:after="80"/>
       </w:pPr>
       <w:r>
-        <w:t>Chuẩn hóa điểm tái xếp hạng thành xác suất tương đối, đo mức áp đảo của mã dẫn đầu so với các ứng viên còn lại. Trừ s_max là thủ thuật ổn định số học tránh tràn số ở hàm exp. Nhiệt độ nhỏ làm phân bố nhọn: chênh 0,1 điểm đủ tạo cách biệt xác suất lớn.</w:t>
+        <w:t>Ánh xạ độ tin cậy sang Condition.verificationStatus theo chuẩn HL7 FHIR R4. Máy KHÔNG BAO GIỜ tự gán “confirmed”: trong đặc tả FHIR, confirmed nghĩa là chẩn đoán đã được xác nhận — hàm ý có người đủ thẩm quyền đứng sau, chứ không phải thuật toán tự chấm mình 85 điểm.</w:t>
+      </w:r>
+      <w:r>
+        <w:br/>
+      </w:r>
+      <w:r>
+        <w:lastRenderedPageBreak/>
+        <w:br/>
+        <w:t>Bản trước gán confirmed cho mọi ca ≥ 85%. Đo trên tập kiểm tra độc lập thì trong nhóm đó vẫn còn ca sai, cao nhất là “viêm kết mạc dị ứng” trả về H10.9 “Viêm kết mạc, không đặc hiệu” với 96,78%. Những bản ghi ấy lên trục dữ liệu mang nhãn đã xác nhận, bệnh viện khác đọc về không có cách nào biết chưa ai duyệt. Đó là sai lệch thông tin y tế sinh ra từ chính khâu gắn nhãn, không phải từ việc mô hình đoán sai — mô hình đoán sai là chuyện bình thường và chấp nhận được, miễn bản ghi nói đúng sự thật về độ chắc chắn của nó.</w:t>
+      </w:r>
+      <w:r>
+        <w:br/>
+        <w:t>Ba mức máy được phép dùng theo đúng nghĩa của từng giá trị trong FHIR: provisional là chẩn đoán sơ bộ đủ vững để làm việc tiếp, differential là một trong nhiều khả năng cần phân định thêm, unconfirmed là chưa đủ căn cứ. Giá trị confirmed chỉ sinh ra khi có thao tác duyệt của bác sĩ.</w:t>
+      </w:r>
+      <w:r>
+        <w:br/>
+      </w:r>
+      <w:r>
+        <w:t>Cần tách bạch requires_review với verificationStatus: một bên quyết định bản ghi có được tự động đẩy lên trục hay không, một bên là bản ghi tự khai độ chắc chắn của mình. Suy requires_review từ band(x) chứ không từ chuỗi trạng thái — nếu vẫn so với “confirmed” thì từ khi máy thôi sinh giá trị đó, mọi ca đều thành cần duyệt và luồng tự động liên thông chết hẳn.</w:t>
       </w:r>
     </w:p>
     <w:p>
@@ -1991,7 +3151,7 @@
           <w:b/>
           <w:sz w:val="20"/>
         </w:rPr>
-        <w:t>Vị trí: nlp/nlp_engine.py — dòng 968–974</w:t>
+        <w:t>Vị trí: nlp/clinical_rules.py — dòng 463–481</w:t>
       </w:r>
     </w:p>
     <w:p>
@@ -2004,55 +3164,126 @@
           <w:rFonts w:ascii="Consolas" w:hAnsi="Consolas"/>
           <w:sz w:val="16"/>
         </w:rPr>
-        <w:t>906 |         scope = ranked[:SOFTMAX_SCOPE]</w:t>
-      </w:r>
-      <w:r>
-        <w:rPr>
-          <w:rFonts w:ascii="Consolas" w:hAnsi="Consolas"/>
-          <w:sz w:val="16"/>
-        </w:rPr>
-        <w:br/>
-        <w:t>907 |         probs: List[float] = []</w:t>
-      </w:r>
-      <w:r>
-        <w:rPr>
-          <w:rFonts w:ascii="Consolas" w:hAnsi="Consolas"/>
-          <w:sz w:val="16"/>
-        </w:rPr>
-        <w:br/>
-        <w:t>908 |         block_mass: Dict[str, float] = {}</w:t>
-      </w:r>
-      <w:r>
-        <w:rPr>
-          <w:rFonts w:ascii="Consolas" w:hAnsi="Consolas"/>
-          <w:sz w:val="16"/>
-        </w:rPr>
-        <w:br/>
-        <w:t>909 |         if scope:</w:t>
-      </w:r>
-      <w:r>
-        <w:rPr>
-          <w:rFonts w:ascii="Consolas" w:hAnsi="Consolas"/>
-          <w:sz w:val="16"/>
-        </w:rPr>
-        <w:br/>
-        <w:t>910 |             top_score = scope[0][1]["score"]</w:t>
-      </w:r>
-      <w:r>
-        <w:rPr>
-          <w:rFonts w:ascii="Consolas" w:hAnsi="Consolas"/>
-          <w:sz w:val="16"/>
-        </w:rPr>
-        <w:br/>
-        <w:t>911 |             exps = np.exp([(kv[1]["score"] - top_score) / SOFTMAX_TEMPERATURE for kv in scope])</w:t>
-      </w:r>
-      <w:r>
-        <w:rPr>
-          <w:rFonts w:ascii="Consolas" w:hAnsi="Consolas"/>
-          <w:sz w:val="16"/>
-        </w:rPr>
-        <w:br/>
-        <w:t>912 |             probs = (exps / exps.sum()).tolist()</w:t>
+        <w:t>463 | def confidence_band(confidence: float) -&gt; str:</w:t>
+      </w:r>
+      <w:r>
+        <w:rPr>
+          <w:rFonts w:ascii="Consolas" w:hAnsi="Consolas"/>
+          <w:sz w:val="16"/>
+        </w:rPr>
+        <w:br/>
+        <w:t>465 |     if confidence &gt;= CONFIDENCE_POLICY["auto_confirm"]:</w:t>
+      </w:r>
+      <w:r>
+        <w:rPr>
+          <w:rFonts w:ascii="Consolas" w:hAnsi="Consolas"/>
+          <w:sz w:val="16"/>
+        </w:rPr>
+        <w:br/>
+        <w:t>466 |         return "high"</w:t>
+      </w:r>
+      <w:r>
+        <w:rPr>
+          <w:rFonts w:ascii="Consolas" w:hAnsi="Consolas"/>
+          <w:sz w:val="16"/>
+        </w:rPr>
+        <w:br/>
+        <w:t>467 |     if confidence &gt;= CONFIDENCE_POLICY["provisional"]:</w:t>
+      </w:r>
+      <w:r>
+        <w:rPr>
+          <w:rFonts w:ascii="Consolas" w:hAnsi="Consolas"/>
+          <w:sz w:val="16"/>
+        </w:rPr>
+        <w:br/>
+        <w:t>468 |         return "medium"</w:t>
+      </w:r>
+      <w:r>
+        <w:rPr>
+          <w:rFonts w:ascii="Consolas" w:hAnsi="Consolas"/>
+          <w:sz w:val="16"/>
+        </w:rPr>
+        <w:br/>
+        <w:t>469 |     return "low"</w:t>
+      </w:r>
+      <w:r>
+        <w:rPr>
+          <w:rFonts w:ascii="Consolas" w:hAnsi="Consolas"/>
+          <w:sz w:val="16"/>
+        </w:rPr>
+        <w:br/>
+        <w:t>472 | def verification_status_for(confidence: float, *, clinician_confirmed: bool = False) -&gt; str:</w:t>
+      </w:r>
+      <w:r>
+        <w:rPr>
+          <w:rFonts w:ascii="Consolas" w:hAnsi="Consolas"/>
+          <w:sz w:val="16"/>
+        </w:rPr>
+        <w:br/>
+        <w:t>475 |     if clinician_confirmed:</w:t>
+      </w:r>
+      <w:r>
+        <w:rPr>
+          <w:rFonts w:ascii="Consolas" w:hAnsi="Consolas"/>
+          <w:sz w:val="16"/>
+        </w:rPr>
+        <w:br/>
+        <w:t>476 |         return "confirmed"</w:t>
+      </w:r>
+      <w:r>
+        <w:rPr>
+          <w:rFonts w:ascii="Consolas" w:hAnsi="Consolas"/>
+          <w:sz w:val="16"/>
+        </w:rPr>
+        <w:br/>
+        <w:t>477 |     if confidence &gt;= CONFIDENCE_POLICY["auto_confirm"]:</w:t>
+      </w:r>
+      <w:r>
+        <w:rPr>
+          <w:rFonts w:ascii="Consolas" w:hAnsi="Consolas"/>
+          <w:sz w:val="16"/>
+        </w:rPr>
+        <w:br/>
+        <w:t>478 |         return "provisional"</w:t>
+      </w:r>
+      <w:r>
+        <w:rPr>
+          <w:rFonts w:ascii="Consolas" w:hAnsi="Consolas"/>
+          <w:sz w:val="16"/>
+        </w:rPr>
+        <w:br/>
+        <w:t>479 |     if confidence &gt;= CONFIDENCE_POLICY["provisional"]:</w:t>
+      </w:r>
+      <w:r>
+        <w:rPr>
+          <w:rFonts w:ascii="Consolas" w:hAnsi="Consolas"/>
+          <w:sz w:val="16"/>
+        </w:rPr>
+        <w:br/>
+        <w:t>480 |         return "differential"</w:t>
+      </w:r>
+      <w:r>
+        <w:rPr>
+          <w:rFonts w:ascii="Consolas" w:hAnsi="Consolas"/>
+          <w:sz w:val="16"/>
+        </w:rPr>
+        <w:br/>
+        <w:t>481 |     return "unconfirmed"</w:t>
+      </w:r>
+      <w:r>
+        <w:rPr>
+          <w:rFonts w:ascii="Consolas" w:hAnsi="Consolas"/>
+          <w:sz w:val="16"/>
+        </w:rPr>
+        <w:br/>
+      </w:r>
+      <w:r>
+        <w:rPr>
+          <w:rFonts w:ascii="Consolas" w:hAnsi="Consolas"/>
+          <w:sz w:val="16"/>
+        </w:rPr>
+        <w:br/>
+        <w:t>backend/main.py:240 |  pred["requires_review"] = confidence_band(pred["confidence"]) != "high"</w:t>
       </w:r>
     </w:p>
     <w:p>
@@ -2060,7 +3291,7 @@
         <w:pStyle w:val="Heading2"/>
       </w:pPr>
       <w:r>
-        <w:t>10. Gộp khối lượng xác suất theo khối 3 ký tự</w:t>
+        <w:t>13. Kế thừa độ tin cậy của cặp chẩn đoán kép †/*</w:t>
       </w:r>
     </w:p>
     <w:p>
@@ -2079,11 +3310,149 @@
       <w:pPr>
         <w:spacing w:before="40" w:after="120"/>
         <w:ind w:left="280"/>
+      </w:pPr>
+      <w:r>
         <w:rPr>
           <w:rFonts w:ascii="Consolas" w:hAnsi="Consolas"/>
           <w:color w:val="000080"/>
           <w:sz w:val="20"/>
         </w:rPr>
+        <w:t>conf(mã † thay thế) = min( conf(bệnh_nguyên), conf(biểu_hiện) )</w:t>
+      </w:r>
+    </w:p>
+    <w:p>
+      <w:pPr>
+        <w:spacing w:before="160" w:after="40"/>
+      </w:pPr>
+      <w:r>
+        <w:rPr>
+          <w:b/>
+          <w:sz w:val="20"/>
+        </w:rPr>
+        <w:t>Giải thích</w:t>
+      </w:r>
+    </w:p>
+    <w:p>
+      <w:pPr>
+        <w:spacing w:after="80"/>
+      </w:pPr>
+      <w:r>
+        <w:t>Một chẩn đoán ghép chỉ chắc chắn bằng vế yếu nhất của nó. Dùng min chứ KHÔNG cộng hai vế lại: chúng đến từ cùng một câu nên không phải hai bằng chứng độc lập, cộng lại là đếm trùng bằng chứng.</w:t>
+      </w:r>
+    </w:p>
+    <w:p>
+      <w:pPr>
+        <w:spacing w:before="160" w:after="40"/>
+      </w:pPr>
+      <w:r>
+        <w:rPr>
+          <w:b/>
+          <w:sz w:val="20"/>
+        </w:rPr>
+        <w:t>Vị trí: nlp/nlp_engine.py — dòng 1236–1242</w:t>
+      </w:r>
+    </w:p>
+    <w:p>
+      <w:pPr>
+        <w:spacing w:before="40" w:after="120"/>
+        <w:ind w:left="280"/>
+      </w:pPr>
+      <w:r>
+        <w:rPr>
+          <w:rFonts w:ascii="Consolas" w:hAnsi="Consolas"/>
+          <w:sz w:val="16"/>
+        </w:rPr>
+        <w:t>1170 |                 # khớp trọn vế nào). Lấy min của hai vế: một chẩn đoán ghép chỉ</w:t>
+      </w:r>
+      <w:r>
+        <w:rPr>
+          <w:rFonts w:ascii="Consolas" w:hAnsi="Consolas"/>
+          <w:sz w:val="16"/>
+        </w:rPr>
+        <w:br/>
+        <w:t>1171 |                 # chắc chắn bằng vế yếu nhất của nó - và KHÔNG cộng hai vế lại,</w:t>
+      </w:r>
+      <w:r>
+        <w:rPr>
+          <w:rFonts w:ascii="Consolas" w:hAnsi="Consolas"/>
+          <w:sz w:val="16"/>
+        </w:rPr>
+        <w:br/>
+        <w:t>1172 |                 # vì chúng đến từ cùng một câu nên không phải bằng chứng độc lập.</w:t>
+      </w:r>
+      <w:r>
+        <w:rPr>
+          <w:rFonts w:ascii="Consolas" w:hAnsi="Consolas"/>
+          <w:sz w:val="16"/>
+        </w:rPr>
+        <w:br/>
+        <w:t>1173 |                 record = dict(record)</w:t>
+      </w:r>
+      <w:r>
+        <w:rPr>
+          <w:rFonts w:ascii="Consolas" w:hAnsi="Consolas"/>
+          <w:sz w:val="16"/>
+        </w:rPr>
+        <w:br/>
+        <w:t>1174 |                 record["confidence"] = round(</w:t>
+      </w:r>
+      <w:r>
+        <w:rPr>
+          <w:rFonts w:ascii="Consolas" w:hAnsi="Consolas"/>
+          <w:sz w:val="16"/>
+        </w:rPr>
+        <w:br/>
+        <w:t xml:space="preserve">1175 |                     min(pool[etiology]["confidence"], </w:t>
+      </w:r>
+      <w:r>
+        <w:rPr>
+          <w:rFonts w:ascii="Consolas" w:hAnsi="Consolas"/>
+          <w:sz w:val="16"/>
+        </w:rPr>
+        <w:lastRenderedPageBreak/>
+        <w:t>pool[manifestation]["confidence"]), 2)</w:t>
+      </w:r>
+      <w:r>
+        <w:rPr>
+          <w:rFonts w:ascii="Consolas" w:hAnsi="Consolas"/>
+          <w:sz w:val="16"/>
+        </w:rPr>
+        <w:br/>
+        <w:t>1176 |                 record["confidence_band"] = confidence_band(record["confidence"])</w:t>
+      </w:r>
+    </w:p>
+    <w:p>
+      <w:pPr>
+        <w:pStyle w:val="Heading1"/>
+      </w:pPr>
+      <w:r>
+        <w:t>D. ĐÁNH GIÁ MÔ HÌNH</w:t>
+      </w:r>
+    </w:p>
+    <w:p>
+      <w:pPr>
+        <w:pStyle w:val="Heading2"/>
+      </w:pPr>
+      <w:r>
+        <w:t>14. Thứ hạng của mã đúng đầu tiên</w:t>
+      </w:r>
+    </w:p>
+    <w:p>
+      <w:pPr>
+        <w:spacing w:before="160" w:after="40"/>
+      </w:pPr>
+      <w:r>
+        <w:rPr>
+          <w:b/>
+          <w:sz w:val="20"/>
+        </w:rPr>
+        <w:t>Công thức</w:t>
+      </w:r>
+    </w:p>
+    <w:p>
+      <w:pPr>
+        <w:spacing w:before="40" w:after="120"/>
+        <w:ind w:left="280"/>
       </w:pPr>
       <w:r>
         <w:rPr>
@@ -2091,7 +3460,7 @@
           <w:color w:val="000080"/>
           <w:sz w:val="20"/>
         </w:rPr>
-        <w:t xml:space="preserve">mass(B) = Σ  p_i(c)      </w:t>
+        <w:t>rank_i = vị trí 1-based của mã đúng đầu tiên trong danh sách gợi ý</w:t>
       </w:r>
       <w:r>
         <w:rPr>
@@ -2100,14 +3469,132 @@
           <w:sz w:val="20"/>
         </w:rPr>
         <w:br/>
-      </w:r>
+        <w:t xml:space="preserve">       = 0 nếu không mã đúng nào lọt top-k</w:t>
+      </w:r>
+    </w:p>
+    <w:p>
+      <w:pPr>
+        <w:spacing w:before="160" w:after="40"/>
+      </w:pPr>
+      <w:r>
+        <w:rPr>
+          <w:b/>
+          <w:sz w:val="20"/>
+        </w:rPr>
+        <w:t>Giải thích</w:t>
+      </w:r>
+      <w:r>
+        <w:br/>
+      </w:r>
+      <w:r>
+        <w:t>Đầu vào cho cả hai chỉ số Top-k và MRR. Mỗi ca kiểm thử có một DANH SÁCH mã chấp nhận được (thường gồm mã khối 3 ký tự và mã chi tiết tương ứng, vì cả hai đều đúng về mặt lâm sàng).</w:t>
+      </w:r>
+    </w:p>
+    <w:p>
+      <w:pPr>
+        <w:spacing w:before="160" w:after="40"/>
+      </w:pPr>
+      <w:r>
+        <w:rPr>
+          <w:b/>
+          <w:sz w:val="20"/>
+        </w:rPr>
+        <w:t>Vị trí: nlp/evaluate.py — dòng 37–43</w:t>
+      </w:r>
+    </w:p>
+    <w:p>
+      <w:pPr>
+        <w:spacing w:before="40" w:after="120"/>
+        <w:ind w:left="280"/>
+      </w:pPr>
+      <w:r>
+        <w:rPr>
+          <w:rFonts w:ascii="Consolas" w:hAnsi="Consolas"/>
+          <w:sz w:val="16"/>
+        </w:rPr>
+        <w:t>37 | def rank_of_hit(predictions, expected_codes) -&gt; int:</w:t>
+      </w:r>
+      <w:r>
+        <w:rPr>
+          <w:rFonts w:ascii="Consolas" w:hAnsi="Consolas"/>
+          <w:sz w:val="16"/>
+        </w:rPr>
+        <w:br/>
+        <w:t>38 |     """Vị trí (1-based) của mã đúng đầu tiên trong danh sách gợi ý, 0 nếu trượt."""</w:t>
+      </w:r>
+      <w:r>
+        <w:rPr>
+          <w:rFonts w:ascii="Consolas" w:hAnsi="Consolas"/>
+          <w:sz w:val="16"/>
+        </w:rPr>
+        <w:br/>
+        <w:t>39 |     accepted = {sanitize_icd10_code(c).upper() for c in expected_codes}</w:t>
+      </w:r>
+      <w:r>
+        <w:rPr>
+          <w:rFonts w:ascii="Consolas" w:hAnsi="Consolas"/>
+          <w:sz w:val="16"/>
+        </w:rPr>
+        <w:br/>
+        <w:t>40 |     for position, pred in enumerate(predictions, start=1):</w:t>
+      </w:r>
+      <w:r>
+        <w:rPr>
+          <w:rFonts w:ascii="Consolas" w:hAnsi="Consolas"/>
+          <w:sz w:val="16"/>
+        </w:rPr>
+        <w:br/>
+        <w:t>41 |         if sanitize_icd10_code(pred["code"]).upper() in accepted:</w:t>
+      </w:r>
+      <w:r>
+        <w:rPr>
+          <w:rFonts w:ascii="Consolas" w:hAnsi="Consolas"/>
+          <w:sz w:val="16"/>
+        </w:rPr>
+        <w:br/>
+        <w:t>42 |             return position</w:t>
+      </w:r>
+      <w:r>
+        <w:rPr>
+          <w:rFonts w:ascii="Consolas" w:hAnsi="Consolas"/>
+          <w:sz w:val="16"/>
+        </w:rPr>
+        <w:br/>
+        <w:t>43 |     return 0</w:t>
+      </w:r>
+    </w:p>
+    <w:p>
+      <w:pPr>
+        <w:pStyle w:val="Heading2"/>
+      </w:pPr>
+      <w:r>
+        <w:t>15. Top-k accuracy và MRR</w:t>
+      </w:r>
+    </w:p>
+    <w:p>
+      <w:pPr>
+        <w:spacing w:before="160" w:after="40"/>
+      </w:pPr>
+      <w:r>
+        <w:rPr>
+          <w:b/>
+          <w:sz w:val="20"/>
+        </w:rPr>
+        <w:t>Công thức</w:t>
+      </w:r>
+    </w:p>
+    <w:p>
+      <w:pPr>
+        <w:spacing w:before="40" w:after="120"/>
+        <w:ind w:left="280"/>
+      </w:pPr>
       <w:r>
         <w:rPr>
           <w:rFonts w:ascii="Consolas" w:hAnsi="Consolas"/>
           <w:color w:val="000080"/>
           <w:sz w:val="20"/>
         </w:rPr>
-        <w:t>với B là khối 3 ký tự, ví dụ E11 ⊃ {E11, E11.9, E11.1, …}c∈B</w:t>
+        <w:t>Top-k = (1/N) × Σ_i  1{ rank_i ≤ k  và  rank_i ≠ 0 }</w:t>
       </w:r>
       <w:r>
         <w:rPr>
@@ -2124,7 +3611,7 @@
           <w:sz w:val="20"/>
         </w:rPr>
         <w:br/>
-        <w:t>relative(c) = { mass(B(c))  nếu c là mã điểm cao nhất trong khối B(c)</w:t>
+        <w:t>MRR   = (1/N) × Σ_i  1 / rank_i(ca trượt đóng góp 0)</w:t>
       </w:r>
       <w:r>
         <w:rPr>
@@ -2133,7 +3620,15 @@
           <w:sz w:val="20"/>
         </w:rPr>
         <w:br/>
-        <w:t xml:space="preserve">              { p_i(c)      nếu khối đã có mã khác nhận khối lượng</w:t>
+      </w:r>
+      <w:r>
+        <w:rPr>
+          <w:rFonts w:ascii="Consolas" w:hAnsi="Consolas"/>
+          <w:color w:val="000080"/>
+          <w:sz w:val="20"/>
+        </w:rPr>
+        <w:br/>
+        <w:t>N : tổng số ca kiểm thử</w:t>
       </w:r>
     </w:p>
     <w:p>
@@ -2153,7 +3648,7 @@
         <w:spacing w:after="80"/>
       </w:pPr>
       <w:r>
-        <w:t>E11 và E11.9 là cùng một chẩn đoán ở hai mức chi tiết. Nếu để chúng chia đôi xác suất thì độ tin cậy bị hạ oan, nên gộp cả khối lại và trao toàn bộ khối lượng cho mã tốt nhất trong khối.</w:t>
+        <w:t>Top-k đo tỷ lệ mã đúng nằm trong k gợi ý đầu. MRR (Mean Reciprocal Rank) đo cả thứ hạng chứ không chỉ trúng hay trượt: mã đúng ở hạng 1 đóng góp 1,0 còn hạng 3 chỉ đóng góp 0,33. Kết quả đo hiện tại: Top-1 = 99,1%, MRR = 0,9932 trên tập phát triển 110 ca; Top-1 = 68,6%, Top-5 = 84,3% trên tập độc lập 51 ca.</w:t>
       </w:r>
     </w:p>
     <w:p>
@@ -2165,7 +3660,7 @@
           <w:b/>
           <w:sz w:val="20"/>
         </w:rPr>
-        <w:t>Vị trí: nlp/nlp_engine.py — dòng 977–994</w:t>
+        <w:t>Vị trí: nlp/evaluate.py — dòng 94–97</w:t>
       </w:r>
     </w:p>
     <w:p>
@@ -2178,150 +3673,31 @@
           <w:rFonts w:ascii="Consolas" w:hAnsi="Consolas"/>
           <w:sz w:val="16"/>
         </w:rPr>
-        <w:t>915 |             for (code, _), p in zip(scope, probs):</w:t>
-      </w:r>
-      <w:r>
-        <w:rPr>
-          <w:rFonts w:ascii="Consolas" w:hAnsi="Consolas"/>
-          <w:sz w:val="16"/>
-        </w:rPr>
-        <w:br/>
-        <w:t>916 |                 block_mass[self._block_of(code)] = block_mass.get(self._block_of(code), 0.0) + p</w:t>
-      </w:r>
-      <w:r>
-        <w:rPr>
-          <w:rFonts w:ascii="Consolas" w:hAnsi="Consolas"/>
-          <w:sz w:val="16"/>
-        </w:rPr>
-        <w:br/>
-        <w:t xml:space="preserve">917 | </w:t>
-      </w:r>
-      <w:r>
-        <w:rPr>
-          <w:rFonts w:ascii="Consolas" w:hAnsi="Consolas"/>
-          <w:sz w:val="16"/>
-        </w:rPr>
-        <w:br/>
-        <w:t>918 |         results = []</w:t>
-      </w:r>
-      <w:r>
-        <w:rPr>
-          <w:rFonts w:ascii="Consolas" w:hAnsi="Consolas"/>
-          <w:sz w:val="16"/>
-        </w:rPr>
-        <w:br/>
-        <w:t>919 |         claimed_blocks = set()</w:t>
-      </w:r>
-      <w:r>
-        <w:rPr>
-          <w:rFonts w:ascii="Consolas" w:hAnsi="Consolas"/>
-          <w:sz w:val="16"/>
-        </w:rPr>
-        <w:br/>
-        <w:t>920 |         for rank, (code, info) in enumerate(ranked[:top_k]):</w:t>
-      </w:r>
-      <w:r>
-        <w:rPr>
-          <w:rFonts w:ascii="Consolas" w:hAnsi="Consolas"/>
-          <w:sz w:val="16"/>
-        </w:rPr>
-        <w:br/>
-        <w:t>921 |             db_entry = self.db_index[code]</w:t>
-      </w:r>
-      <w:r>
-        <w:rPr>
-          <w:rFonts w:ascii="Consolas" w:hAnsi="Consolas"/>
-          <w:sz w:val="16"/>
-        </w:rPr>
-        <w:br/>
-        <w:t>922 |             block = self._block_of(code)</w:t>
-      </w:r>
-      <w:r>
-        <w:rPr>
-          <w:rFonts w:ascii="Consolas" w:hAnsi="Consolas"/>
-          <w:sz w:val="16"/>
-        </w:rPr>
-        <w:br/>
-        <w:t>923 |             if rank &lt; len(probs):</w:t>
-      </w:r>
-      <w:r>
-        <w:rPr>
-          <w:rFonts w:ascii="Consolas" w:hAnsi="Consolas"/>
-          <w:sz w:val="16"/>
-        </w:rPr>
-        <w:br/>
-      </w:r>
-      <w:r>
-        <w:rPr>
-          <w:rFonts w:ascii="Consolas" w:hAnsi="Consolas"/>
-          <w:sz w:val="16"/>
-        </w:rPr>
-        <w:lastRenderedPageBreak/>
-        <w:t>924 |                 # Mã tốt nhất trong khối nhận toàn bộ khối lượng xác suất của khối.</w:t>
-      </w:r>
-      <w:r>
-        <w:rPr>
-          <w:rFonts w:ascii="Consolas" w:hAnsi="Consolas"/>
-          <w:sz w:val="16"/>
-        </w:rPr>
-        <w:br/>
-        <w:t>925 |                 if block in claimed_blocks:</w:t>
-      </w:r>
-      <w:r>
-        <w:rPr>
-          <w:rFonts w:ascii="Consolas" w:hAnsi="Consolas"/>
-          <w:sz w:val="16"/>
-        </w:rPr>
-        <w:br/>
-        <w:t>926 |                     relative = probs[rank]</w:t>
-      </w:r>
-      <w:r>
-        <w:rPr>
-          <w:rFonts w:ascii="Consolas" w:hAnsi="Consolas"/>
-          <w:sz w:val="16"/>
-        </w:rPr>
-        <w:br/>
-        <w:t>927 |                 else:</w:t>
-      </w:r>
-      <w:r>
-        <w:rPr>
-          <w:rFonts w:ascii="Consolas" w:hAnsi="Consolas"/>
-          <w:sz w:val="16"/>
-        </w:rPr>
-        <w:br/>
-        <w:t>928 |                     relative = block_mass.get(block, probs[rank])</w:t>
-      </w:r>
-      <w:r>
-        <w:rPr>
-          <w:rFonts w:ascii="Consolas" w:hAnsi="Consolas"/>
-          <w:sz w:val="16"/>
-        </w:rPr>
-        <w:br/>
-        <w:t>929 |                     claimed_blocks.add(block)</w:t>
-      </w:r>
-      <w:r>
-        <w:rPr>
-          <w:rFonts w:ascii="Consolas" w:hAnsi="Consolas"/>
-          <w:sz w:val="16"/>
-        </w:rPr>
-        <w:br/>
-        <w:t>930 |             else:</w:t>
-      </w:r>
-      <w:r>
-        <w:rPr>
-          <w:rFonts w:ascii="Consolas" w:hAnsi="Consolas"/>
-          <w:sz w:val="16"/>
-        </w:rPr>
-        <w:br/>
-        <w:t>931 |                 relative = 0.0</w:t>
-      </w:r>
-      <w:r>
-        <w:rPr>
-          <w:rFonts w:ascii="Consolas" w:hAnsi="Consolas"/>
-          <w:sz w:val="16"/>
-        </w:rPr>
-        <w:br/>
-        <w:t>932 |             confidence = self._calibrate(relative, info["raw"])</w:t>
+        <w:t>94 |         "top1": hits[1] / total,</w:t>
+      </w:r>
+      <w:r>
+        <w:rPr>
+          <w:rFonts w:ascii="Consolas" w:hAnsi="Consolas"/>
+          <w:sz w:val="16"/>
+        </w:rPr>
+        <w:br/>
+        <w:t>95 |         "top3": hits[3] / total,</w:t>
+      </w:r>
+      <w:r>
+        <w:rPr>
+          <w:rFonts w:ascii="Consolas" w:hAnsi="Consolas"/>
+          <w:sz w:val="16"/>
+        </w:rPr>
+        <w:br/>
+        <w:t>96 |         "top5": hits[5] / total,</w:t>
+      </w:r>
+      <w:r>
+        <w:rPr>
+          <w:rFonts w:ascii="Consolas" w:hAnsi="Consolas"/>
+          <w:sz w:val="16"/>
+        </w:rPr>
+        <w:br/>
+        <w:t>97 |         "mrr": reciprocal_sum / total,</w:t>
       </w:r>
     </w:p>
     <w:p>
@@ -2329,7 +3705,7 @@
         <w:pStyle w:val="Heading2"/>
       </w:pPr>
       <w:r>
-        <w:t>11. Chuẩn hóa min–max, trộn tuyến tính và sàn theo độ phủ</w:t>
+        <w:t>16. Phân vị độ trễ</w:t>
       </w:r>
     </w:p>
     <w:p>
@@ -2355,7 +3731,8 @@
           <w:color w:val="000080"/>
           <w:sz w:val="20"/>
         </w:rPr>
-        <w:t>absolute = clamp( (cos_raw − 0,40) / (0,90 − 0,40), 0, 1 )</w:t>
+        <w:lastRenderedPageBreak/>
+        <w:t>p50 = L[ ⌊N / 2⌋ ]</w:t>
       </w:r>
       <w:r>
         <w:rPr>
@@ -2364,6 +3741,7 @@
           <w:sz w:val="20"/>
         </w:rPr>
         <w:br/>
+        <w:t>p95 = L[ ⌊0,95 × N⌋ ]</w:t>
       </w:r>
       <w:r>
         <w:rPr>
@@ -2372,7 +3750,6 @@
           <w:sz w:val="20"/>
         </w:rPr>
         <w:br/>
-        <w:t>coverage = |T_q ∩ T_e| / |T_q|          (tỉ lệ từ của câu được tên mã phủ)</w:t>
       </w:r>
       <w:r>
         <w:rPr>
@@ -2381,32 +3758,664 @@
           <w:sz w:val="20"/>
         </w:rPr>
         <w:br/>
-      </w:r>
+        <w:t>L : mảng độ trễ đã sắp xếp tăng dần</w:t>
+      </w:r>
+    </w:p>
+    <w:p>
+      <w:pPr>
+        <w:spacing w:before="160" w:after="40"/>
+      </w:pPr>
+      <w:r>
+        <w:rPr>
+          <w:b/>
+          <w:sz w:val="20"/>
+        </w:rPr>
+        <w:t>Giải thích</w:t>
+      </w:r>
+    </w:p>
+    <w:p>
+      <w:pPr>
+        <w:spacing w:after="80"/>
+      </w:pPr>
+      <w:r>
+        <w:t>Đo bằng phân vị chứ không chỉ trung bình, vì trung bình che giấu phần đuôi chậm. Kết quả đo hiện tại (danh mục 12.137 mã, chạy trên GPU RTX 3050): trung bình 65 ms, p50 = 58 ms, p95 = 95 ms.</w:t>
+      </w:r>
+    </w:p>
+    <w:p>
+      <w:pPr>
+        <w:spacing w:before="160" w:after="40"/>
+      </w:pPr>
+      <w:r>
+        <w:rPr>
+          <w:b/>
+          <w:sz w:val="20"/>
+        </w:rPr>
+        <w:t>Vị trí: nlp/evaluate.py — dòng 99–101</w:t>
+      </w:r>
+      <w:r>
+        <w:br/>
+      </w:r>
+      <w:r>
+        <w:rPr>
+          <w:rFonts w:ascii="Consolas" w:hAnsi="Consolas"/>
+          <w:sz w:val="16"/>
+        </w:rPr>
+        <w:t>99 |             "mean": sum(latencies) / len(latencies),</w:t>
+      </w:r>
+      <w:r>
+        <w:rPr>
+          <w:rFonts w:ascii="Consolas" w:hAnsi="Consolas"/>
+          <w:sz w:val="16"/>
+        </w:rPr>
+        <w:br/>
+        <w:t>100 |             "p50": latencies[len(latencies) // 2],</w:t>
+      </w:r>
+      <w:r>
+        <w:rPr>
+          <w:rFonts w:ascii="Consolas" w:hAnsi="Consolas"/>
+          <w:sz w:val="16"/>
+        </w:rPr>
+        <w:br/>
+        <w:t>101 |             "p95": latencies[int(len(latencies) * 0.95)],</w:t>
+      </w:r>
+    </w:p>
+    <w:p>
+      <w:pPr>
+        <w:pStyle w:val="Heading1"/>
+      </w:pPr>
+      <w:r>
+        <w:t>E. BĂM VÀ KIỂM CHỨNG CACHE</w:t>
+      </w:r>
+    </w:p>
+    <w:p>
+      <w:pPr>
+        <w:pStyle w:val="Heading2"/>
+      </w:pPr>
+      <w:r>
+        <w:t>17. Vân tay trọng số mô hình</w:t>
+      </w:r>
+    </w:p>
+    <w:p>
+      <w:pPr>
+        <w:spacing w:before="160" w:after="40"/>
+      </w:pPr>
+      <w:r>
+        <w:rPr>
+          <w:b/>
+          <w:sz w:val="20"/>
+        </w:rPr>
+        <w:t>Công thức</w:t>
+      </w:r>
+    </w:p>
+    <w:p>
+      <w:pPr>
+        <w:spacing w:before="40" w:after="120"/>
+        <w:ind w:left="280"/>
+      </w:pPr>
       <w:r>
         <w:rPr>
           <w:rFonts w:ascii="Consolas" w:hAnsi="Consolas"/>
           <w:color w:val="000080"/>
           <w:sz w:val="20"/>
         </w:rPr>
-        <w:br/>
-        <w:t>coverage := 0  nếu ∃ trục t : nhãn_e(t) ≠ ∅ ∧ nhãn_q(t) ≠ nhãn_e(t)</w:t>
-      </w:r>
+        <w:t>fp = SHA1( ⊕_i [ tên_file_i ‖ kích_thước_i ‖ 1MB_đầu_i ‖ 1MB_cuối_i ] )[0:12]</w:t>
+      </w:r>
+    </w:p>
+    <w:p>
+      <w:pPr>
+        <w:spacing w:before="160" w:after="40"/>
+      </w:pPr>
+      <w:r>
+        <w:rPr>
+          <w:b/>
+          <w:sz w:val="20"/>
+        </w:rPr>
+        <w:t>Giải thích</w:t>
+      </w:r>
+    </w:p>
+    <w:p>
+      <w:pPr>
+        <w:spacing w:after="80"/>
+      </w:pPr>
+      <w:r>
+        <w:t>Băm 2 MB thay vì toàn bộ ~540 MB để không thêm vài giây vào mỗi lần khởi động; huấn luyện lại luôn làm đổi các byte này. Thiếu bước này, khi fine-tune lại vào cùng thư mục thì hệ thống vẫn nạp vector của checkpoint cũ: một truy vấn trùng khít mục từ chỉ đạt cosine 0,77 thay vì 1,0.</w:t>
+      </w:r>
+    </w:p>
+    <w:p>
+      <w:pPr>
+        <w:spacing w:before="160" w:after="40"/>
+      </w:pPr>
+      <w:r>
+        <w:rPr>
+          <w:b/>
+          <w:sz w:val="20"/>
+        </w:rPr>
+        <w:t>Vị trí: nlp/nlp_engine.py — dòng 194–236</w:t>
+      </w:r>
+    </w:p>
+    <w:p>
+      <w:pPr>
+        <w:spacing w:before="40" w:after="120"/>
+        <w:ind w:left="280"/>
+      </w:pPr>
+      <w:r>
+        <w:rPr>
+          <w:rFonts w:ascii="Consolas" w:hAnsi="Consolas"/>
+          <w:sz w:val="16"/>
+        </w:rPr>
+        <w:t>187 |     def _model_fingerprint(self) -&gt; str:</w:t>
+      </w:r>
+      <w:r>
+        <w:rPr>
+          <w:rFonts w:ascii="Consolas" w:hAnsi="Consolas"/>
+          <w:sz w:val="16"/>
+        </w:rPr>
+        <w:br/>
+        <w:t>188 |         """</w:t>
+      </w:r>
+      <w:r>
+        <w:rPr>
+          <w:rFonts w:ascii="Consolas" w:hAnsi="Consolas"/>
+          <w:sz w:val="16"/>
+        </w:rPr>
+        <w:br/>
+        <w:t>189 |         Vân tay của TRỌNG SỐ mô hình cục bộ.</w:t>
+      </w:r>
+      <w:r>
+        <w:rPr>
+          <w:rFonts w:ascii="Consolas" w:hAnsi="Consolas"/>
+          <w:sz w:val="16"/>
+        </w:rPr>
+        <w:br/>
+        <w:t xml:space="preserve">190 | </w:t>
+      </w:r>
+      <w:r>
+        <w:rPr>
+          <w:rFonts w:ascii="Consolas" w:hAnsi="Consolas"/>
+          <w:sz w:val="16"/>
+        </w:rPr>
+        <w:br/>
+        <w:t>191 |         Khóa cache bản trước chỉ gồm TÊN thư mục mô hình, nên khi fine-tune lại</w:t>
+      </w:r>
+      <w:r>
+        <w:rPr>
+          <w:rFonts w:ascii="Consolas" w:hAnsi="Consolas"/>
+          <w:sz w:val="16"/>
+        </w:rPr>
+        <w:br/>
+        <w:t>192 |         vào cùng thư mục, hệ thống vẫn nạp vector của checkpoint cũ: một truy vấn</w:t>
+      </w:r>
+      <w:r>
+        <w:rPr>
+          <w:rFonts w:ascii="Consolas" w:hAnsi="Consolas"/>
+          <w:sz w:val="16"/>
+        </w:rPr>
+        <w:br/>
+        <w:t>193 |         trùng khít mục từ ("đậu khỉ" -&gt; "Đậu khỉ") chỉ đạt cosine 0.77 thay vì</w:t>
+      </w:r>
+      <w:r>
+        <w:rPr>
+          <w:rFonts w:ascii="Consolas" w:hAnsi="Consolas"/>
+          <w:sz w:val="16"/>
+        </w:rPr>
+        <w:br/>
+        <w:t>194 |         1.0, kéo độ tin cậy xuống ~86% và làm lệch thứ hạng.</w:t>
+      </w:r>
+      <w:r>
+        <w:rPr>
+          <w:rFonts w:ascii="Consolas" w:hAnsi="Consolas"/>
+          <w:sz w:val="16"/>
+        </w:rPr>
+        <w:br/>
+        <w:t xml:space="preserve">195 | </w:t>
+      </w:r>
+      <w:r>
+        <w:rPr>
+          <w:rFonts w:ascii="Consolas" w:hAnsi="Consolas"/>
+          <w:sz w:val="16"/>
+        </w:rPr>
+        <w:br/>
+        <w:t>196 |         Chỉ băm kích thước + 1 MB đầu và 1 MB cuối của file trọng số thay vì toàn</w:t>
+      </w:r>
+      <w:r>
+        <w:rPr>
+          <w:rFonts w:ascii="Consolas" w:hAnsi="Consolas"/>
+          <w:sz w:val="16"/>
+        </w:rPr>
+        <w:br/>
+        <w:t>197 |         bộ ~540 MB, để không thêm vài giây vào mỗi lần khởi động; huấn luyện lại</w:t>
+      </w:r>
+      <w:r>
+        <w:rPr>
+          <w:rFonts w:ascii="Consolas" w:hAnsi="Consolas"/>
+          <w:sz w:val="16"/>
+        </w:rPr>
+        <w:br/>
+        <w:t>198 |         luôn làm đổi các byte này. Dùng NỘI DUNG file chứ không dùng mtime để</w:t>
+      </w:r>
+      <w:r>
+        <w:rPr>
+          <w:rFonts w:ascii="Consolas" w:hAnsi="Consolas"/>
+          <w:sz w:val="16"/>
+        </w:rPr>
+        <w:br/>
+        <w:t>199 |         cache vẫn hiệu lực khi chép dự án sang máy khác.</w:t>
+      </w:r>
+      <w:r>
+        <w:rPr>
+          <w:rFonts w:ascii="Consolas" w:hAnsi="Consolas"/>
+          <w:sz w:val="16"/>
+        </w:rPr>
+        <w:br/>
+        <w:t>200 |         """</w:t>
+      </w:r>
+      <w:r>
+        <w:rPr>
+          <w:rFonts w:ascii="Consolas" w:hAnsi="Consolas"/>
+          <w:sz w:val="16"/>
+        </w:rPr>
+        <w:br/>
+        <w:t>201 |         if self._fingerprint is not None:</w:t>
+      </w:r>
+      <w:r>
+        <w:rPr>
+          <w:rFonts w:ascii="Consolas" w:hAnsi="Consolas"/>
+          <w:sz w:val="16"/>
+        </w:rPr>
+        <w:br/>
+        <w:t>202 |             return self._fingerprint</w:t>
+      </w:r>
+      <w:r>
+        <w:rPr>
+          <w:rFonts w:ascii="Consolas" w:hAnsi="Consolas"/>
+          <w:sz w:val="16"/>
+        </w:rPr>
+        <w:br/>
+        <w:t xml:space="preserve">203 | </w:t>
+      </w:r>
+      <w:r>
+        <w:rPr>
+          <w:rFonts w:ascii="Consolas" w:hAnsi="Consolas"/>
+          <w:sz w:val="16"/>
+        </w:rPr>
+        <w:br/>
+        <w:t>204 |         if not os.path.isdir(self.model_name):</w:t>
+      </w:r>
+      <w:r>
+        <w:rPr>
+          <w:rFonts w:ascii="Consolas" w:hAnsi="Consolas"/>
+          <w:sz w:val="16"/>
+        </w:rPr>
+        <w:br/>
+        <w:t>205 |             # Mô hình trên hub: tên đã bao hàm định danh phiên bản.</w:t>
+      </w:r>
+      <w:r>
+        <w:rPr>
+          <w:rFonts w:ascii="Consolas" w:hAnsi="Consolas"/>
+          <w:sz w:val="16"/>
+        </w:rPr>
+        <w:br/>
+        <w:t>206 |             self._fingerprint = ""</w:t>
+      </w:r>
+      <w:r>
+        <w:rPr>
+          <w:rFonts w:ascii="Consolas" w:hAnsi="Consolas"/>
+          <w:sz w:val="16"/>
+        </w:rPr>
+        <w:br/>
+        <w:t>207 |             return self._fingerprint</w:t>
+      </w:r>
+      <w:r>
+        <w:rPr>
+          <w:rFonts w:ascii="Consolas" w:hAnsi="Consolas"/>
+          <w:sz w:val="16"/>
+        </w:rPr>
+        <w:br/>
+        <w:t xml:space="preserve">208 | </w:t>
+      </w:r>
+      <w:r>
+        <w:rPr>
+          <w:rFonts w:ascii="Consolas" w:hAnsi="Consolas"/>
+          <w:sz w:val="16"/>
+        </w:rPr>
+        <w:br/>
+        <w:t>209 |         chunk = 1 &lt;&lt; 20</w:t>
+      </w:r>
+      <w:r>
+        <w:rPr>
+          <w:rFonts w:ascii="Consolas" w:hAnsi="Consolas"/>
+          <w:sz w:val="16"/>
+        </w:rPr>
+        <w:br/>
+        <w:t>210 |         digest = hashlib.sha1()</w:t>
+      </w:r>
+      <w:r>
+        <w:rPr>
+          <w:rFonts w:ascii="Consolas" w:hAnsi="Consolas"/>
+          <w:sz w:val="16"/>
+        </w:rPr>
+        <w:br/>
+      </w:r>
+      <w:r>
+        <w:rPr>
+          <w:rFonts w:ascii="Consolas" w:hAnsi="Consolas"/>
+          <w:sz w:val="16"/>
+        </w:rPr>
+        <w:lastRenderedPageBreak/>
+        <w:t>211 |         for relative in ("model.safetensors", "pytorch_model.bin", "model.onnx",</w:t>
+      </w:r>
+      <w:r>
+        <w:rPr>
+          <w:rFonts w:ascii="Consolas" w:hAnsi="Consolas"/>
+          <w:sz w:val="16"/>
+        </w:rPr>
+        <w:br/>
+        <w:t>212 |                          "config.json", "sentence_bert_config.json",</w:t>
+      </w:r>
+      <w:r>
+        <w:rPr>
+          <w:rFonts w:ascii="Consolas" w:hAnsi="Consolas"/>
+          <w:sz w:val="16"/>
+        </w:rPr>
+        <w:br/>
+        <w:t>213 |                          os.path.join("1_Pooling", "config.json")):</w:t>
+      </w:r>
+      <w:r>
+        <w:rPr>
+          <w:rFonts w:ascii="Consolas" w:hAnsi="Consolas"/>
+          <w:sz w:val="16"/>
+        </w:rPr>
+        <w:br/>
+        <w:t>214 |             path = os.path.join(self.model_name, relative)</w:t>
+      </w:r>
+      <w:r>
+        <w:rPr>
+          <w:rFonts w:ascii="Consolas" w:hAnsi="Consolas"/>
+          <w:sz w:val="16"/>
+        </w:rPr>
+        <w:br/>
+        <w:t>215 |             if not os.path.exists(path):</w:t>
+      </w:r>
+      <w:r>
+        <w:rPr>
+          <w:rFonts w:ascii="Consolas" w:hAnsi="Consolas"/>
+          <w:sz w:val="16"/>
+        </w:rPr>
+        <w:br/>
+        <w:t>216 |                 continue</w:t>
+      </w:r>
+      <w:r>
+        <w:rPr>
+          <w:rFonts w:ascii="Consolas" w:hAnsi="Consolas"/>
+          <w:sz w:val="16"/>
+        </w:rPr>
+        <w:br/>
+        <w:t>217 |             size = os.path.getsize(path)</w:t>
+      </w:r>
+      <w:r>
+        <w:rPr>
+          <w:rFonts w:ascii="Consolas" w:hAnsi="Consolas"/>
+          <w:sz w:val="16"/>
+        </w:rPr>
+        <w:br/>
+        <w:t>218 |             digest.update(f"{relative}:{size}".encode("utf-8"))</w:t>
+      </w:r>
+      <w:r>
+        <w:rPr>
+          <w:rFonts w:ascii="Consolas" w:hAnsi="Consolas"/>
+          <w:sz w:val="16"/>
+        </w:rPr>
+        <w:br/>
+        <w:t>219 |             try:</w:t>
+      </w:r>
+      <w:r>
+        <w:rPr>
+          <w:rFonts w:ascii="Consolas" w:hAnsi="Consolas"/>
+          <w:sz w:val="16"/>
+        </w:rPr>
+        <w:br/>
+        <w:t>220 |                 with open(path, "rb") as f:</w:t>
+      </w:r>
+      <w:r>
+        <w:rPr>
+          <w:rFonts w:ascii="Consolas" w:hAnsi="Consolas"/>
+          <w:sz w:val="16"/>
+        </w:rPr>
+        <w:br/>
+        <w:t>221 |                     digest.update(f.read(chunk))</w:t>
+      </w:r>
+      <w:r>
+        <w:rPr>
+          <w:rFonts w:ascii="Consolas" w:hAnsi="Consolas"/>
+          <w:sz w:val="16"/>
+        </w:rPr>
+        <w:br/>
+        <w:t>222 |                     if size &gt; 2 * chunk:</w:t>
+      </w:r>
+      <w:r>
+        <w:rPr>
+          <w:rFonts w:ascii="Consolas" w:hAnsi="Consolas"/>
+          <w:sz w:val="16"/>
+        </w:rPr>
+        <w:br/>
+        <w:t>223 |                         f.seek(-chunk, os.SEEK_END)</w:t>
+      </w:r>
+      <w:r>
+        <w:rPr>
+          <w:rFonts w:ascii="Consolas" w:hAnsi="Consolas"/>
+          <w:sz w:val="16"/>
+        </w:rPr>
+        <w:br/>
+        <w:t>224 |                         digest.update(f.read(chunk))</w:t>
+      </w:r>
+      <w:r>
+        <w:rPr>
+          <w:rFonts w:ascii="Consolas" w:hAnsi="Consolas"/>
+          <w:sz w:val="16"/>
+        </w:rPr>
+        <w:br/>
+        <w:t>225 |             except OSError:</w:t>
+      </w:r>
+      <w:r>
+        <w:rPr>
+          <w:rFonts w:ascii="Consolas" w:hAnsi="Consolas"/>
+          <w:sz w:val="16"/>
+        </w:rPr>
+        <w:br/>
+        <w:t>226 |                 continue</w:t>
+      </w:r>
+      <w:r>
+        <w:rPr>
+          <w:rFonts w:ascii="Consolas" w:hAnsi="Consolas"/>
+          <w:sz w:val="16"/>
+        </w:rPr>
+        <w:br/>
+        <w:t xml:space="preserve">227 | </w:t>
+      </w:r>
+      <w:r>
+        <w:rPr>
+          <w:rFonts w:ascii="Consolas" w:hAnsi="Consolas"/>
+          <w:sz w:val="16"/>
+        </w:rPr>
+        <w:br/>
+        <w:t>228 |         self._fingerprint = digest.hexdigest()[:12]</w:t>
+      </w:r>
+      <w:r>
+        <w:rPr>
+          <w:rFonts w:ascii="Consolas" w:hAnsi="Consolas"/>
+          <w:sz w:val="16"/>
+        </w:rPr>
+        <w:br/>
+        <w:t>229 |         return self._fingerprint</w:t>
+      </w:r>
+    </w:p>
+    <w:p>
+      <w:pPr>
+        <w:pStyle w:val="Heading2"/>
+      </w:pPr>
+      <w:r>
+        <w:t>18. Hash nội dung danh mục</w:t>
+      </w:r>
+    </w:p>
+    <w:p>
+      <w:pPr>
+        <w:spacing w:before="160" w:after="40"/>
+      </w:pPr>
+      <w:r>
+        <w:rPr>
+          <w:b/>
+          <w:sz w:val="20"/>
+        </w:rPr>
+        <w:t>Công thức</w:t>
+      </w:r>
+    </w:p>
+    <w:p>
+      <w:pPr>
+        <w:spacing w:before="40" w:after="120"/>
+        <w:ind w:left="280"/>
+      </w:pPr>
       <w:r>
         <w:rPr>
           <w:rFonts w:ascii="Consolas" w:hAnsi="Consolas"/>
           <w:color w:val="000080"/>
           <w:sz w:val="20"/>
         </w:rPr>
-        <w:br/>
-      </w:r>
+        <w:t>h = SHA1( ⊕_{e ∈ DB} [ code ‖ name_vi ‖ name_en ‖ synonyms ] )[0:12]</w:t>
+      </w:r>
+    </w:p>
+    <w:p>
+      <w:pPr>
+        <w:spacing w:before="160" w:after="40"/>
+      </w:pPr>
+      <w:r>
+        <w:rPr>
+          <w:b/>
+          <w:sz w:val="20"/>
+        </w:rPr>
+        <w:t>Giải thích</w:t>
+      </w:r>
+    </w:p>
+    <w:p>
+      <w:pPr>
+        <w:spacing w:after="80"/>
+      </w:pPr>
+      <w:r>
+        <w:t>Dùng hash NỘI DUNG danh mục thay cho số lượng bản ghi, để không bao giờ nạp nhầm cache cũ khi danh mục đổi nội dung mà giữ nguyên số dòng. Chính cơ chế này khiến việc chuẩn hóa Unicode NFC cho 198 mã tự động kích hoạt dựng lại cache.</w:t>
+      </w:r>
+    </w:p>
+    <w:p>
+      <w:pPr>
+        <w:spacing w:before="160" w:after="40"/>
+      </w:pPr>
+      <w:r>
+        <w:rPr>
+          <w:b/>
+          <w:sz w:val="20"/>
+        </w:rPr>
+        <w:t>Vị trí: nlp/nlp_engine.py — dòng 285–292</w:t>
+      </w:r>
+    </w:p>
+    <w:p>
+      <w:pPr>
+        <w:spacing w:before="40" w:after="120"/>
+        <w:ind w:left="280"/>
+      </w:pPr>
+      <w:r>
+        <w:rPr>
+          <w:rFonts w:ascii="Consolas" w:hAnsi="Consolas"/>
+          <w:sz w:val="16"/>
+        </w:rPr>
+        <w:t>278 |         digest = hashlib.sha1()</w:t>
+      </w:r>
+      <w:r>
+        <w:rPr>
+          <w:rFonts w:ascii="Consolas" w:hAnsi="Consolas"/>
+          <w:sz w:val="16"/>
+        </w:rPr>
+        <w:br/>
+        <w:t>279 |         for entry in self.db:</w:t>
+      </w:r>
+      <w:r>
+        <w:rPr>
+          <w:rFonts w:ascii="Consolas" w:hAnsi="Consolas"/>
+          <w:sz w:val="16"/>
+        </w:rPr>
+        <w:br/>
+        <w:t>280 |             digest.update(entry["code"].encode("utf-8"))</w:t>
+      </w:r>
+      <w:r>
+        <w:rPr>
+          <w:rFonts w:ascii="Consolas" w:hAnsi="Consolas"/>
+          <w:sz w:val="16"/>
+        </w:rPr>
+        <w:br/>
+        <w:t>281 |             digest.update(entry["name_vi"].encode("utf-8"))</w:t>
+      </w:r>
+      <w:r>
+        <w:rPr>
+          <w:rFonts w:ascii="Consolas" w:hAnsi="Consolas"/>
+          <w:sz w:val="16"/>
+        </w:rPr>
+        <w:br/>
+        <w:t>282 |             digest.update((entry.get("name_en") or "").encode("utf-8"))</w:t>
+      </w:r>
+      <w:r>
+        <w:rPr>
+          <w:rFonts w:ascii="Consolas" w:hAnsi="Consolas"/>
+          <w:sz w:val="16"/>
+        </w:rPr>
+        <w:br/>
+        <w:t>283 |             for syn in entry.get("synonyms", []):</w:t>
+      </w:r>
+      <w:r>
+        <w:rPr>
+          <w:rFonts w:ascii="Consolas" w:hAnsi="Consolas"/>
+          <w:sz w:val="16"/>
+        </w:rPr>
+        <w:br/>
+        <w:t>284 |                 digest.update(syn.encode("utf-8"))</w:t>
+      </w:r>
+      <w:r>
+        <w:rPr>
+          <w:rFonts w:ascii="Consolas" w:hAnsi="Consolas"/>
+          <w:sz w:val="16"/>
+        </w:rPr>
+        <w:br/>
+        <w:t>285 |         return model_key, digest.hexdigest()[:12]</w:t>
+      </w:r>
+    </w:p>
+    <w:p>
+      <w:pPr>
+        <w:pStyle w:val="Heading2"/>
+      </w:pPr>
+      <w:r>
+        <w:t>19. Kiểm chứng cache bằng mẫu dò</w:t>
+      </w:r>
+    </w:p>
+    <w:p>
+      <w:pPr>
+        <w:spacing w:before="160" w:after="40"/>
+      </w:pPr>
+      <w:r>
+        <w:rPr>
+          <w:b/>
+          <w:sz w:val="20"/>
+        </w:rPr>
+        <w:t>Công thức</w:t>
+      </w:r>
+    </w:p>
+    <w:p>
+      <w:pPr>
+        <w:spacing w:before="40" w:after="120"/>
+        <w:ind w:left="280"/>
+      </w:pPr>
       <w:r>
         <w:rPr>
           <w:rFonts w:ascii="Consolas" w:hAnsi="Consolas"/>
           <w:color w:val="000080"/>
           <w:sz w:val="20"/>
         </w:rPr>
-        <w:br/>
-        <w:t>blended  = 0,65 × relative + 0,35 × absolute</w:t>
+        <w:t>với i ∈ { 0, ⌊n/2⌋, n−1 } :</w:t>
       </w:r>
       <w:r>
         <w:rPr>
@@ -2415,6 +4424,7 @@
           <w:sz w:val="20"/>
         </w:rPr>
         <w:br/>
+        <w:t xml:space="preserve">    cos( encode(text_i), cache_i ) ≥ 0,999</w:t>
       </w:r>
       <w:r>
         <w:rPr>
@@ -2423,7 +4433,6 @@
           <w:sz w:val="20"/>
         </w:rPr>
         <w:br/>
-        <w:t>blended  := max(blended; 0,88)  nếu coverage = 1 ∧ cos_raw ≥ 0,90</w:t>
       </w:r>
       <w:r>
         <w:rPr>
@@ -2432,15 +4441,7 @@
           <w:sz w:val="20"/>
         </w:rPr>
         <w:br/>
-      </w:r>
-      <w:r>
-        <w:rPr>
-          <w:rFonts w:ascii="Consolas" w:hAnsi="Consolas"/>
-          <w:color w:val="000080"/>
-          <w:sz w:val="20"/>
-        </w:rPr>
-        <w:br/>
-        <w:t>tin_cậy  = 100 × clamp( blended, 0, 1 )</w:t>
+        <w:t>cos(a,b) = (a · b) / (‖a‖ × ‖b‖)</w:t>
       </w:r>
     </w:p>
     <w:p>
@@ -2460,27 +4461,7 @@
         <w:spacing w:after="80"/>
       </w:pPr>
       <w:r>
-        <w:t>Độ tin cậy KHÔNG lấy trực tiếp từ điểm tái xếp hạng: điểm đó có cộng thưởng nên dễ vượt trần và mọi kết quả sẽ hiện 100%, làm mất tác dụng của ngưỡng duyệt. Thay vào đó kết hợp ba thành phần độc lập — relative đo mức áp đảo so với ứng viên khác, absolute đo mức khớp thật với danh mục, coverage đo câu có được tên mã phủ trọn hay không.</w:t>
-      </w:r>
-      <w:r>
-        <w:br/>
-        <w:t>Vì sao cần thêm coverage: relative chiếm 65% điểm số nhưng nó đo mức áp đảo chứ không đo mức đúng, nên câu khớp gần tuyệt đối vẫn bị hạ điểm chỉ vì danh mục còn mã lân cận. Đo trên tập kiểm tra độc lập: “bệnh van hai lá do thấp” khớp I05 “Bệnh lý van hai lá do thấp” ở cosine 0,991 — gần như trùng nghĩa hoàn toàn — nhưng chỉ được 56,26% vì các mã van tim khác chia mất xác suất softmax. Gộp khối 3 ký tự (công thức 10) đã xử lý phần anh em cùng mã cha nhưng không xử lý được các khối lân cận về mặt lâm sàng (I05 với I08, I34). Khi câu được phủ trọn và cosine ≥ 0,90 thì đó là khớp trọn nghĩa, đặt sàn 0,88 để yếu tố cạnh tranh không kéo xuống.</w:t>
-      </w:r>
-      <w:r>
-        <w:br/>
-        <w:t>Cổng lọc phủ định là điều kiện bắt buộc kèm theo, vì coverage đếm theo túi từ nên mù với hai kiểu sai nguy hiểm. Một là mã tự khẳng định thêm: câu “phình động mạch chủ bụng” không nói vỡ hay chưa, mã I71.3 “Phình động mạch chủ bụng, vỡ” lại chứa đủ mọi từ của câu. Hai là phủ định gắn sai chỗ: “viêm mũi không dị ứng” và “Viêm mũi dị ứng, không phân loại” dùng chung đúng bấy nhiêu từ, chỉ khác chỗ đặt chữ “không”, mà nghĩa thì ngược hẳn. Nguyên tắc: trục nào tên mã khẳng định thì câu phải khẳng định y hệt — câu im lặng không tính là đồng ý.</w:t>
-      </w:r>
-      <w:r>
-        <w:br/>
-        <w:t>Coverage cũng chặn chiều ngược lại, thứ cosine không chặn nổi: “viêm kết mạc dị ứng” khớp H10.9 “Viêm kết mạc, không đặc hiệu” ở cosine 0,953 nhưng thiếu hẳn hai từ “dị ứng” — đúng phần mang nghĩa phân biệt.</w:t>
-      </w:r>
-      <w:r>
-        <w:br/>
-        <w:t xml:space="preserve">Hiệu quả đo được trên tập holdout 51 ca: số ca đúng đạt mức tin cậy cao tăng từ 22 lên 25, số ca </w:t>
-      </w:r>
-      <w:r>
-        <w:lastRenderedPageBreak/>
-        <w:t>sai lọt mức cao giữ nguyên 2, độ chính xác trong mức cao tăng từ 91,7% lên 92,6%. Top-1 và Top-3 không đổi — cơ chế này chỉ tác động lên độ tin cậy, không đổi thứ tự xếp hạng.</w:t>
+        <w:t>Lưới an toàn cuối cùng: mã hóa lại 3 mục từ mẫu rồi so cosine với vector tương ứng trong cache — cùng mô hình thì phải xấp xỉ 1,0. Cần thiết vì cache sai mô hình làm mọi điểm cosine lệch mà KHÔNG có lỗi nào được ném ra.</w:t>
       </w:r>
     </w:p>
     <w:p>
@@ -2492,7 +4473,7 @@
           <w:b/>
           <w:sz w:val="20"/>
         </w:rPr>
-        <w:t>Vị trí: nlp/nlp_engine.py — dòng 799–827</w:t>
+        <w:t>Vị trí: nlp/nlp_engine.py — dòng 238–264</w:t>
       </w:r>
     </w:p>
     <w:p>
@@ -2505,1608 +4486,7 @@
           <w:rFonts w:ascii="Consolas" w:hAnsi="Consolas"/>
           <w:sz w:val="16"/>
         </w:rPr>
-        <w:t>799 |     def _calibrate(relative: float, similarity: float, coverage: float = 0.0) -&gt; float:</w:t>
-      </w:r>
-      <w:r>
-        <w:rPr>
-          <w:rFonts w:ascii="Consolas" w:hAnsi="Consolas"/>
-          <w:sz w:val="16"/>
-        </w:rPr>
-        <w:br/>
-        <w:t>822 |         absolute = (similarity - SIM_FLOOR) / (SIM_CEIL - SIM_FLOOR)</w:t>
-      </w:r>
-      <w:r>
-        <w:rPr>
-          <w:rFonts w:ascii="Consolas" w:hAnsi="Consolas"/>
-          <w:sz w:val="16"/>
-        </w:rPr>
-        <w:br/>
-        <w:t>823 |         absolute = max(0.0, min(1.0, absolute))</w:t>
-      </w:r>
-      <w:r>
-        <w:rPr>
-          <w:rFonts w:ascii="Consolas" w:hAnsi="Consolas"/>
-          <w:sz w:val="16"/>
-        </w:rPr>
-        <w:br/>
-        <w:t>824 |         blended = W_RELATIVE * relative + W_ABSOLUTE * absolute</w:t>
-      </w:r>
-      <w:r>
-        <w:rPr>
-          <w:rFonts w:ascii="Consolas" w:hAnsi="Consolas"/>
-          <w:sz w:val="16"/>
-        </w:rPr>
-        <w:br/>
-        <w:t>825 |         if coverage &gt;= COVERAGE_FULL and similarity &gt;= COVERAGE_FLOOR_SIM:</w:t>
-      </w:r>
-      <w:r>
-        <w:rPr>
-          <w:rFonts w:ascii="Consolas" w:hAnsi="Consolas"/>
-          <w:sz w:val="16"/>
-        </w:rPr>
-        <w:br/>
-        <w:t>826 |             blended = max(blended, COVERAGE_FLOOR_CONF)</w:t>
-      </w:r>
-      <w:r>
-        <w:rPr>
-          <w:rFonts w:ascii="Consolas" w:hAnsi="Consolas"/>
-          <w:sz w:val="16"/>
-        </w:rPr>
-        <w:br/>
-        <w:t>827 |         return round(max(0.0, min(1.0, blended)) * 100, 2)</w:t>
-      </w:r>
-      <w:r>
-        <w:rPr>
-          <w:rFonts w:ascii="Consolas" w:hAnsi="Consolas"/>
-          <w:sz w:val="16"/>
-        </w:rPr>
-        <w:br/>
-      </w:r>
-      <w:r>
-        <w:rPr>
-          <w:rFonts w:ascii="Consolas" w:hAnsi="Consolas"/>
-          <w:sz w:val="16"/>
-        </w:rPr>
-        <w:br/>
-        <w:t>951 |             coverage = (len(q_tokens &amp; self._entry_tokens[idx]) / len(q_tokens)</w:t>
-      </w:r>
-      <w:r>
-        <w:rPr>
-          <w:rFonts w:ascii="Consolas" w:hAnsi="Consolas"/>
-          <w:sz w:val="16"/>
-        </w:rPr>
-        <w:br/>
-        <w:t>952 |                         if q_tokens else 0.0)</w:t>
-      </w:r>
-      <w:r>
-        <w:rPr>
-          <w:rFonts w:ascii="Consolas" w:hAnsi="Consolas"/>
-          <w:sz w:val="16"/>
-        </w:rPr>
-        <w:br/>
-      </w:r>
-      <w:r>
-        <w:rPr>
-          <w:rFonts w:ascii="Consolas" w:hAnsi="Consolas"/>
-          <w:sz w:val="16"/>
-        </w:rPr>
-        <w:br/>
-        <w:t>995 |             eligible = (info.get("coverage", 0.0)</w:t>
-      </w:r>
-      <w:r>
-        <w:rPr>
-          <w:rFonts w:ascii="Consolas" w:hAnsi="Consolas"/>
-          <w:sz w:val="16"/>
-        </w:rPr>
-        <w:br/>
-        <w:t>996 |                         if self._polarity_compatible(q_labels, code) else 0.0)</w:t>
-      </w:r>
-      <w:r>
-        <w:rPr>
-          <w:rFonts w:ascii="Consolas" w:hAnsi="Consolas"/>
-          <w:sz w:val="16"/>
-        </w:rPr>
-        <w:br/>
-        <w:t>997 |             confidence = self._calibrate(relative, info["raw"], eligible)</w:t>
-      </w:r>
-    </w:p>
-    <w:p>
-      <w:pPr>
-        <w:pStyle w:val="Heading2"/>
-      </w:pPr>
-      <w:r>
-        <w:t>12. Phân mức độ tin cậy và ánh xạ trạng thái FHIR</w:t>
-      </w:r>
-    </w:p>
-    <w:p>
-      <w:pPr>
-        <w:spacing w:before="160" w:after="40"/>
-      </w:pPr>
-      <w:r>
-        <w:rPr>
-          <w:b/>
-          <w:sz w:val="20"/>
-        </w:rPr>
-        <w:t>Công thức</w:t>
-      </w:r>
-    </w:p>
-    <w:p>
-      <w:pPr>
-        <w:spacing w:before="40" w:after="120"/>
-        <w:ind w:left="280"/>
-      </w:pPr>
-      <w:r>
-        <w:rPr>
-          <w:rFonts w:ascii="Consolas" w:hAnsi="Consolas"/>
-          <w:color w:val="000080"/>
-          <w:sz w:val="20"/>
-        </w:rPr>
-        <w:t>band(x) = { high    nếu x ≥ 85</w:t>
-      </w:r>
-      <w:r>
-        <w:rPr>
-          <w:rFonts w:ascii="Consolas" w:hAnsi="Consolas"/>
-          <w:color w:val="000080"/>
-          <w:sz w:val="20"/>
-        </w:rPr>
-        <w:br/>
-        <w:t xml:space="preserve">          { medium  nếu x ≥ 60</w:t>
-      </w:r>
-      <w:r>
-        <w:rPr>
-          <w:rFonts w:ascii="Consolas" w:hAnsi="Consolas"/>
-          <w:color w:val="000080"/>
-          <w:sz w:val="20"/>
-        </w:rPr>
-        <w:br/>
-        <w:t xml:space="preserve">          { low     nếu x &lt; 60</w:t>
-      </w:r>
-      <w:r>
-        <w:rPr>
-          <w:rFonts w:ascii="Consolas" w:hAnsi="Consolas"/>
-          <w:color w:val="000080"/>
-          <w:sz w:val="20"/>
-        </w:rPr>
-        <w:br/>
-      </w:r>
-      <w:r>
-        <w:rPr>
-          <w:rFonts w:ascii="Consolas" w:hAnsi="Consolas"/>
-          <w:color w:val="000080"/>
-          <w:sz w:val="20"/>
-        </w:rPr>
-        <w:br/>
-        <w:t>verificationStatus = { provisional   nếu x ≥ 85</w:t>
-      </w:r>
-      <w:r>
-        <w:rPr>
-          <w:rFonts w:ascii="Consolas" w:hAnsi="Consolas"/>
-          <w:color w:val="000080"/>
-          <w:sz w:val="20"/>
-        </w:rPr>
-        <w:br/>
-        <w:t xml:space="preserve">                     { differential  nếu x ≥ 60</w:t>
-      </w:r>
-      <w:r>
-        <w:rPr>
-          <w:rFonts w:ascii="Consolas" w:hAnsi="Consolas"/>
-          <w:color w:val="000080"/>
-          <w:sz w:val="20"/>
-        </w:rPr>
-        <w:br/>
-        <w:t xml:space="preserve">                     { unconfirmed   nếu x &lt; 60</w:t>
-      </w:r>
-      <w:r>
-        <w:rPr>
-          <w:rFonts w:ascii="Consolas" w:hAnsi="Consolas"/>
-          <w:color w:val="000080"/>
-          <w:sz w:val="20"/>
-        </w:rPr>
-        <w:br/>
-        <w:t xml:space="preserve">                     { confirmed     chỉ khi có thao tác duyệt của bác sĩ</w:t>
-      </w:r>
-      <w:r>
-        <w:rPr>
-          <w:rFonts w:ascii="Consolas" w:hAnsi="Consolas"/>
-          <w:color w:val="000080"/>
-          <w:sz w:val="20"/>
-        </w:rPr>
-        <w:br/>
-      </w:r>
-      <w:r>
-        <w:rPr>
-          <w:rFonts w:ascii="Consolas" w:hAnsi="Consolas"/>
-          <w:color w:val="000080"/>
-          <w:sz w:val="20"/>
-        </w:rPr>
-        <w:br/>
-        <w:t>requires_review = ( band(x) ≠ high )</w:t>
-      </w:r>
-      <w:r>
-        <w:rPr>
-          <w:rFonts w:ascii="Consolas" w:hAnsi="Consolas"/>
-          <w:color w:val="000080"/>
-          <w:sz w:val="20"/>
-        </w:rPr>
-        <w:br/>
-        <w:t>x &lt; 40 → từ chối sinh tài nguyên FHIR (HTTP 422)</w:t>
-      </w:r>
-    </w:p>
-    <w:p>
-      <w:pPr>
-        <w:spacing w:before="160" w:after="40"/>
-      </w:pPr>
-      <w:r>
-        <w:rPr>
-          <w:b/>
-          <w:sz w:val="20"/>
-        </w:rPr>
-        <w:t>Giải thích</w:t>
-      </w:r>
-    </w:p>
-    <w:p>
-      <w:pPr>
-        <w:spacing w:after="80"/>
-      </w:pPr>
-      <w:r>
-        <w:t>Ánh xạ độ tin cậy sang Condition.verificationStatus theo chuẩn HL7 FHIR R4. Máy KHÔNG BAO GIỜ tự gán “confirmed”: trong đặc tả FHIR, confirmed nghĩa là chẩn đoán đã được xác nhận — hàm ý có người đủ thẩm quyền đứng sau, chứ không phải thuật toán tự chấm mình 85 điểm.</w:t>
-      </w:r>
-      <w:r>
-        <w:br/>
-      </w:r>
-      <w:r>
-        <w:br/>
-        <w:t>Bản trước gán confirmed cho mọi ca ≥ 85%. Đo trên tập kiểm tra độc lập thì trong nhóm đó vẫn còn ca sai, cao nhất là “viêm kết mạc dị ứng” trả về H10.9 “Viêm kết mạc, không đặc hiệu” với 96,78%. Những bản ghi ấy lên trục dữ liệu mang nhãn đã xác nhận, bệnh viện khác đọc về không có cách nào biết chưa ai duyệt. Đó là sai lệch thông tin y tế sinh ra từ chính khâu gắn nhãn, không phải từ việc mô hình đoán sai — mô hình đoán sai là chuyện bình thường và chấp nhận được, miễn bản ghi nói đúng sự thật về độ chắc chắn của nó.</w:t>
-      </w:r>
-      <w:r>
-        <w:br/>
-        <w:t>Ba mức máy được phép dùng theo đúng nghĩa của từng giá trị trong FHIR: provisional là chẩn đoán sơ bộ đủ vững để làm việc tiếp, differential là một trong nhiều khả năng cần phân định thêm, unconfirmed là chưa đủ căn cứ. Giá trị confirmed chỉ sinh ra khi có thao tác duyệt của bác sĩ.</w:t>
-      </w:r>
-      <w:r>
-        <w:br/>
-      </w:r>
-      <w:r>
         <w:lastRenderedPageBreak/>
-        <w:t>Cần tách bạch requires_review với verificationStatus: một bên quyết định bản ghi có được tự động đẩy lên trục hay không, một bên là bản ghi tự khai độ chắc chắn của mình. Suy requires_review từ band(x) chứ không từ chuỗi trạng thái — nếu vẫn so với “confirmed” thì từ khi máy thôi sinh giá trị đó, mọi ca đều thành cần duyệt và luồng tự động liên thông chết hẳn.</w:t>
-      </w:r>
-    </w:p>
-    <w:p>
-      <w:pPr>
-        <w:spacing w:before="160" w:after="40"/>
-      </w:pPr>
-      <w:r>
-        <w:rPr>
-          <w:b/>
-          <w:sz w:val="20"/>
-        </w:rPr>
-        <w:t>Vị trí: nlp/clinical_rules.py — dòng 463–481</w:t>
-      </w:r>
-    </w:p>
-    <w:p>
-      <w:pPr>
-        <w:spacing w:before="40" w:after="120"/>
-        <w:ind w:left="280"/>
-      </w:pPr>
-      <w:r>
-        <w:rPr>
-          <w:rFonts w:ascii="Consolas" w:hAnsi="Consolas"/>
-          <w:sz w:val="16"/>
-        </w:rPr>
-        <w:t>463 | def confidence_band(confidence: float) -&gt; str:</w:t>
-      </w:r>
-      <w:r>
-        <w:rPr>
-          <w:rFonts w:ascii="Consolas" w:hAnsi="Consolas"/>
-          <w:sz w:val="16"/>
-        </w:rPr>
-        <w:br/>
-        <w:t>465 |     if confidence &gt;= CONFIDENCE_POLICY["auto_confirm"]:</w:t>
-      </w:r>
-      <w:r>
-        <w:rPr>
-          <w:rFonts w:ascii="Consolas" w:hAnsi="Consolas"/>
-          <w:sz w:val="16"/>
-        </w:rPr>
-        <w:br/>
-        <w:t>466 |         return "high"</w:t>
-      </w:r>
-      <w:r>
-        <w:rPr>
-          <w:rFonts w:ascii="Consolas" w:hAnsi="Consolas"/>
-          <w:sz w:val="16"/>
-        </w:rPr>
-        <w:br/>
-        <w:t>467 |     if confidence &gt;= CONFIDENCE_POLICY["provisional"]:</w:t>
-      </w:r>
-      <w:r>
-        <w:rPr>
-          <w:rFonts w:ascii="Consolas" w:hAnsi="Consolas"/>
-          <w:sz w:val="16"/>
-        </w:rPr>
-        <w:br/>
-        <w:t>468 |         return "medium"</w:t>
-      </w:r>
-      <w:r>
-        <w:rPr>
-          <w:rFonts w:ascii="Consolas" w:hAnsi="Consolas"/>
-          <w:sz w:val="16"/>
-        </w:rPr>
-        <w:br/>
-        <w:t>469 |     return "low"</w:t>
-      </w:r>
-      <w:r>
-        <w:rPr>
-          <w:rFonts w:ascii="Consolas" w:hAnsi="Consolas"/>
-          <w:sz w:val="16"/>
-        </w:rPr>
-        <w:br/>
-        <w:t>472 | def verification_status_for(confidence: float, *, clinician_confirmed: bool = False) -&gt; str:</w:t>
-      </w:r>
-      <w:r>
-        <w:rPr>
-          <w:rFonts w:ascii="Consolas" w:hAnsi="Consolas"/>
-          <w:sz w:val="16"/>
-        </w:rPr>
-        <w:br/>
-        <w:t>475 |     if clinician_confirmed:</w:t>
-      </w:r>
-      <w:r>
-        <w:rPr>
-          <w:rFonts w:ascii="Consolas" w:hAnsi="Consolas"/>
-          <w:sz w:val="16"/>
-        </w:rPr>
-        <w:br/>
-        <w:t>476 |         return "confirmed"</w:t>
-      </w:r>
-      <w:r>
-        <w:rPr>
-          <w:rFonts w:ascii="Consolas" w:hAnsi="Consolas"/>
-          <w:sz w:val="16"/>
-        </w:rPr>
-        <w:br/>
-        <w:t>477 |     if confidence &gt;= CONFIDENCE_POLICY["auto_confirm"]:</w:t>
-      </w:r>
-      <w:r>
-        <w:rPr>
-          <w:rFonts w:ascii="Consolas" w:hAnsi="Consolas"/>
-          <w:sz w:val="16"/>
-        </w:rPr>
-        <w:br/>
-        <w:t>478 |         return "provisional"</w:t>
-      </w:r>
-      <w:r>
-        <w:rPr>
-          <w:rFonts w:ascii="Consolas" w:hAnsi="Consolas"/>
-          <w:sz w:val="16"/>
-        </w:rPr>
-        <w:br/>
-        <w:t>479 |     if confidence &gt;= CONFIDENCE_POLICY["provisional"]:</w:t>
-      </w:r>
-      <w:r>
-        <w:rPr>
-          <w:rFonts w:ascii="Consolas" w:hAnsi="Consolas"/>
-          <w:sz w:val="16"/>
-        </w:rPr>
-        <w:br/>
-        <w:t>480 |         return "differential"</w:t>
-      </w:r>
-      <w:r>
-        <w:rPr>
-          <w:rFonts w:ascii="Consolas" w:hAnsi="Consolas"/>
-          <w:sz w:val="16"/>
-        </w:rPr>
-        <w:br/>
-        <w:t>481 |     return "unconfirmed"</w:t>
-      </w:r>
-      <w:r>
-        <w:rPr>
-          <w:rFonts w:ascii="Consolas" w:hAnsi="Consolas"/>
-          <w:sz w:val="16"/>
-        </w:rPr>
-        <w:br/>
-      </w:r>
-      <w:r>
-        <w:rPr>
-          <w:rFonts w:ascii="Consolas" w:hAnsi="Consolas"/>
-          <w:sz w:val="16"/>
-        </w:rPr>
-        <w:br/>
-        <w:t>backend/main.py:240 |  pred["requires_review"] = confidence_band(pred["confidence"]) != "high"</w:t>
-      </w:r>
-    </w:p>
-    <w:p>
-      <w:pPr>
-        <w:pStyle w:val="Heading2"/>
-      </w:pPr>
-      <w:r>
-        <w:t>13. Kế thừa độ tin cậy của cặp chẩn đoán kép †/*</w:t>
-      </w:r>
-    </w:p>
-    <w:p>
-      <w:pPr>
-        <w:spacing w:before="160" w:after="40"/>
-      </w:pPr>
-      <w:r>
-        <w:rPr>
-          <w:b/>
-          <w:sz w:val="20"/>
-        </w:rPr>
-        <w:t>Công thức</w:t>
-      </w:r>
-    </w:p>
-    <w:p>
-      <w:pPr>
-        <w:spacing w:before="40" w:after="120"/>
-        <w:ind w:left="280"/>
-      </w:pPr>
-      <w:r>
-        <w:rPr>
-          <w:rFonts w:ascii="Consolas" w:hAnsi="Consolas"/>
-          <w:color w:val="000080"/>
-          <w:sz w:val="20"/>
-        </w:rPr>
-        <w:t>conf(mã † thay thế) = min( conf(bệnh_nguyên), conf(biểu_hiện) )</w:t>
-      </w:r>
-    </w:p>
-    <w:p>
-      <w:pPr>
-        <w:spacing w:before="160" w:after="40"/>
-      </w:pPr>
-      <w:r>
-        <w:rPr>
-          <w:b/>
-          <w:sz w:val="20"/>
-        </w:rPr>
-        <w:t>Giải thích</w:t>
-      </w:r>
-    </w:p>
-    <w:p>
-      <w:pPr>
-        <w:spacing w:after="80"/>
-      </w:pPr>
-      <w:r>
-        <w:t>Một chẩn đoán ghép chỉ chắc chắn bằng vế yếu nhất của nó. Dùng min chứ KHÔNG cộng hai vế lại: chúng đến từ cùng một câu nên không phải hai bằng chứng độc lập, cộng lại là đếm trùng bằng chứng.</w:t>
-      </w:r>
-    </w:p>
-    <w:p>
-      <w:pPr>
-        <w:spacing w:before="160" w:after="40"/>
-      </w:pPr>
-      <w:r>
-        <w:rPr>
-          <w:b/>
-          <w:sz w:val="20"/>
-        </w:rPr>
-        <w:t>Vị trí: nlp/nlp_engine.py — dòng 1236–1242</w:t>
-      </w:r>
-    </w:p>
-    <w:p>
-      <w:pPr>
-        <w:spacing w:before="40" w:after="120"/>
-        <w:ind w:left="280"/>
-      </w:pPr>
-      <w:r>
-        <w:rPr>
-          <w:rFonts w:ascii="Consolas" w:hAnsi="Consolas"/>
-          <w:sz w:val="16"/>
-        </w:rPr>
-        <w:t>1170 |                 # khớp trọn vế nào). Lấy min của hai vế: một chẩn đoán ghép chỉ</w:t>
-      </w:r>
-      <w:r>
-        <w:rPr>
-          <w:rFonts w:ascii="Consolas" w:hAnsi="Consolas"/>
-          <w:sz w:val="16"/>
-        </w:rPr>
-        <w:br/>
-        <w:t>1171 |                 # chắc chắn bằng vế yếu nhất của nó - và KHÔNG cộng hai vế lại,</w:t>
-      </w:r>
-      <w:r>
-        <w:rPr>
-          <w:rFonts w:ascii="Consolas" w:hAnsi="Consolas"/>
-          <w:sz w:val="16"/>
-        </w:rPr>
-        <w:br/>
-        <w:t>1172 |                 # vì chúng đến từ cùng một câu nên không phải bằng chứng độc lập.</w:t>
-      </w:r>
-      <w:r>
-        <w:rPr>
-          <w:rFonts w:ascii="Consolas" w:hAnsi="Consolas"/>
-          <w:sz w:val="16"/>
-        </w:rPr>
-        <w:br/>
-        <w:t>1173 |                 record = dict(record)</w:t>
-      </w:r>
-      <w:r>
-        <w:rPr>
-          <w:rFonts w:ascii="Consolas" w:hAnsi="Consolas"/>
-          <w:sz w:val="16"/>
-        </w:rPr>
-        <w:br/>
-        <w:t>1174 |                 record["confidence"] = round(</w:t>
-      </w:r>
-      <w:r>
-        <w:rPr>
-          <w:rFonts w:ascii="Consolas" w:hAnsi="Consolas"/>
-          <w:sz w:val="16"/>
-        </w:rPr>
-        <w:br/>
-        <w:t>1175 |                     min(pool[etiology]["confidence"], pool[manifestation]["confidence"]), 2)</w:t>
-      </w:r>
-      <w:r>
-        <w:rPr>
-          <w:rFonts w:ascii="Consolas" w:hAnsi="Consolas"/>
-          <w:sz w:val="16"/>
-        </w:rPr>
-        <w:br/>
-        <w:t>1176 |                 record["confidence_band"] = confidence_band(record["confidence"])</w:t>
-      </w:r>
-    </w:p>
-    <w:p>
-      <w:pPr>
-        <w:pStyle w:val="Heading1"/>
-      </w:pPr>
-      <w:r>
-        <w:t>D. ĐÁNH GIÁ MÔ HÌNH</w:t>
-      </w:r>
-    </w:p>
-    <w:p>
-      <w:pPr>
-        <w:pStyle w:val="Heading2"/>
-      </w:pPr>
-      <w:r>
-        <w:t>14. Thứ hạng của mã đúng đầu tiên</w:t>
-      </w:r>
-    </w:p>
-    <w:p>
-      <w:pPr>
-        <w:spacing w:before="160" w:after="40"/>
-      </w:pPr>
-      <w:r>
-        <w:rPr>
-          <w:b/>
-          <w:sz w:val="20"/>
-        </w:rPr>
-        <w:t>Công thức</w:t>
-      </w:r>
-    </w:p>
-    <w:p>
-      <w:pPr>
-        <w:spacing w:before="40" w:after="120"/>
-        <w:ind w:left="280"/>
-      </w:pPr>
-      <w:r>
-        <w:rPr>
-          <w:rFonts w:ascii="Consolas" w:hAnsi="Consolas"/>
-          <w:color w:val="000080"/>
-          <w:sz w:val="20"/>
-        </w:rPr>
-        <w:t>rank_i = vị trí 1-based của mã đúng đầu tiên trong danh sách gợi ý</w:t>
-      </w:r>
-      <w:r>
-        <w:rPr>
-          <w:rFonts w:ascii="Consolas" w:hAnsi="Consolas"/>
-          <w:color w:val="000080"/>
-          <w:sz w:val="20"/>
-        </w:rPr>
-        <w:br/>
-        <w:t xml:space="preserve">       = 0 nếu không mã đúng nào lọt top-k</w:t>
-      </w:r>
-    </w:p>
-    <w:p>
-      <w:pPr>
-        <w:spacing w:before="160" w:after="40"/>
-      </w:pPr>
-      <w:r>
-        <w:rPr>
-          <w:b/>
-          <w:sz w:val="20"/>
-        </w:rPr>
-        <w:lastRenderedPageBreak/>
-        <w:t>Giải thích</w:t>
-      </w:r>
-      <w:r>
-        <w:br/>
-      </w:r>
-      <w:r>
-        <w:t>Đầu vào cho cả hai chỉ số Top-k và MRR. Mỗi ca kiểm thử có một DANH SÁCH mã chấp nhận được (thường gồm mã khối 3 ký tự và mã chi tiết tương ứng, vì cả hai đều đúng về mặt lâm sàng).</w:t>
-      </w:r>
-    </w:p>
-    <w:p>
-      <w:pPr>
-        <w:spacing w:before="160" w:after="40"/>
-      </w:pPr>
-      <w:r>
-        <w:rPr>
-          <w:b/>
-          <w:sz w:val="20"/>
-        </w:rPr>
-        <w:t>Vị trí: nlp/evaluate.py — dòng 37–43</w:t>
-      </w:r>
-    </w:p>
-    <w:p>
-      <w:pPr>
-        <w:spacing w:before="40" w:after="120"/>
-        <w:ind w:left="280"/>
-      </w:pPr>
-      <w:r>
-        <w:rPr>
-          <w:rFonts w:ascii="Consolas" w:hAnsi="Consolas"/>
-          <w:sz w:val="16"/>
-        </w:rPr>
-        <w:t>37 | def rank_of_hit(predictions, expected_codes) -&gt; int:</w:t>
-      </w:r>
-      <w:r>
-        <w:rPr>
-          <w:rFonts w:ascii="Consolas" w:hAnsi="Consolas"/>
-          <w:sz w:val="16"/>
-        </w:rPr>
-        <w:br/>
-        <w:t>38 |     """Vị trí (1-based) của mã đúng đầu tiên trong danh sách gợi ý, 0 nếu trượt."""</w:t>
-      </w:r>
-      <w:r>
-        <w:rPr>
-          <w:rFonts w:ascii="Consolas" w:hAnsi="Consolas"/>
-          <w:sz w:val="16"/>
-        </w:rPr>
-        <w:br/>
-        <w:t>39 |     accepted = {sanitize_icd10_code(c).upper() for c in expected_codes}</w:t>
-      </w:r>
-      <w:r>
-        <w:rPr>
-          <w:rFonts w:ascii="Consolas" w:hAnsi="Consolas"/>
-          <w:sz w:val="16"/>
-        </w:rPr>
-        <w:br/>
-        <w:t>40 |     for position, pred in enumerate(predictions, start=1):</w:t>
-      </w:r>
-      <w:r>
-        <w:rPr>
-          <w:rFonts w:ascii="Consolas" w:hAnsi="Consolas"/>
-          <w:sz w:val="16"/>
-        </w:rPr>
-        <w:br/>
-        <w:t>41 |         if sanitize_icd10_code(pred["code"]).upper() in accepted:</w:t>
-      </w:r>
-      <w:r>
-        <w:rPr>
-          <w:rFonts w:ascii="Consolas" w:hAnsi="Consolas"/>
-          <w:sz w:val="16"/>
-        </w:rPr>
-        <w:br/>
-        <w:t>42 |             return position</w:t>
-      </w:r>
-      <w:r>
-        <w:rPr>
-          <w:rFonts w:ascii="Consolas" w:hAnsi="Consolas"/>
-          <w:sz w:val="16"/>
-        </w:rPr>
-        <w:br/>
-        <w:t>43 |     return 0</w:t>
-      </w:r>
-    </w:p>
-    <w:p>
-      <w:pPr>
-        <w:pStyle w:val="Heading2"/>
-      </w:pPr>
-      <w:r>
-        <w:t>15. Top-k accuracy và MRR</w:t>
-      </w:r>
-    </w:p>
-    <w:p>
-      <w:pPr>
-        <w:spacing w:before="160" w:after="40"/>
-      </w:pPr>
-      <w:r>
-        <w:rPr>
-          <w:b/>
-          <w:sz w:val="20"/>
-        </w:rPr>
-        <w:t>Công thức</w:t>
-      </w:r>
-    </w:p>
-    <w:p>
-      <w:pPr>
-        <w:spacing w:before="40" w:after="120"/>
-        <w:ind w:left="280"/>
-      </w:pPr>
-      <w:r>
-        <w:rPr>
-          <w:rFonts w:ascii="Consolas" w:hAnsi="Consolas"/>
-          <w:color w:val="000080"/>
-          <w:sz w:val="20"/>
-        </w:rPr>
-        <w:t>Top-k = (1/N) × Σ_i  1{ rank_i ≤ k  và  rank_i ≠ 0 }</w:t>
-      </w:r>
-      <w:r>
-        <w:rPr>
-          <w:rFonts w:ascii="Consolas" w:hAnsi="Consolas"/>
-          <w:color w:val="000080"/>
-          <w:sz w:val="20"/>
-        </w:rPr>
-        <w:br/>
-      </w:r>
-      <w:r>
-        <w:rPr>
-          <w:rFonts w:ascii="Consolas" w:hAnsi="Consolas"/>
-          <w:color w:val="000080"/>
-          <w:sz w:val="20"/>
-        </w:rPr>
-        <w:br/>
-        <w:t>MRR   = (1/N) × Σ_i  1 / rank_i(ca trượt đóng góp 0)</w:t>
-      </w:r>
-      <w:r>
-        <w:rPr>
-          <w:rFonts w:ascii="Consolas" w:hAnsi="Consolas"/>
-          <w:color w:val="000080"/>
-          <w:sz w:val="20"/>
-        </w:rPr>
-        <w:br/>
-      </w:r>
-      <w:r>
-        <w:rPr>
-          <w:rFonts w:ascii="Consolas" w:hAnsi="Consolas"/>
-          <w:color w:val="000080"/>
-          <w:sz w:val="20"/>
-        </w:rPr>
-        <w:br/>
-        <w:t>N : tổng số ca kiểm thử</w:t>
-      </w:r>
-    </w:p>
-    <w:p>
-      <w:pPr>
-        <w:spacing w:before="160" w:after="40"/>
-      </w:pPr>
-      <w:r>
-        <w:rPr>
-          <w:b/>
-          <w:sz w:val="20"/>
-        </w:rPr>
-        <w:t>Giải thích</w:t>
-      </w:r>
-    </w:p>
-    <w:p>
-      <w:pPr>
-        <w:spacing w:after="80"/>
-      </w:pPr>
-      <w:r>
-        <w:t>Top-k đo tỷ lệ mã đúng nằm trong k gợi ý đầu. MRR (Mean Reciprocal Rank) đo cả thứ hạng chứ không chỉ trúng hay trượt: mã đúng ở hạng 1 đóng góp 1,0 còn hạng 3 chỉ đóng góp 0,33. Kết quả đo hiện tại: Top-1 = 99,1%, MRR = 0,9932 trên tập phát triển 110 ca; Top-1 = 68,6%, Top-5 = 84,3% trên tập độc lập 51 ca.</w:t>
-      </w:r>
-    </w:p>
-    <w:p>
-      <w:pPr>
-        <w:spacing w:before="160" w:after="40"/>
-      </w:pPr>
-      <w:r>
-        <w:rPr>
-          <w:b/>
-          <w:sz w:val="20"/>
-        </w:rPr>
-        <w:t>Vị trí: nlp/evaluate.py — dòng 94–97</w:t>
-      </w:r>
-    </w:p>
-    <w:p>
-      <w:pPr>
-        <w:spacing w:before="40" w:after="120"/>
-        <w:ind w:left="280"/>
-      </w:pPr>
-      <w:r>
-        <w:rPr>
-          <w:rFonts w:ascii="Consolas" w:hAnsi="Consolas"/>
-          <w:sz w:val="16"/>
-        </w:rPr>
-        <w:t>94 |         "top1": hits[1] / total,</w:t>
-      </w:r>
-      <w:r>
-        <w:rPr>
-          <w:rFonts w:ascii="Consolas" w:hAnsi="Consolas"/>
-          <w:sz w:val="16"/>
-        </w:rPr>
-        <w:br/>
-        <w:t>95 |         "top3": hits[3] / total,</w:t>
-      </w:r>
-      <w:r>
-        <w:rPr>
-          <w:rFonts w:ascii="Consolas" w:hAnsi="Consolas"/>
-          <w:sz w:val="16"/>
-        </w:rPr>
-        <w:br/>
-        <w:t>96 |         "top5": hits[5] / total,</w:t>
-      </w:r>
-      <w:r>
-        <w:rPr>
-          <w:rFonts w:ascii="Consolas" w:hAnsi="Consolas"/>
-          <w:sz w:val="16"/>
-        </w:rPr>
-        <w:br/>
-        <w:t>97 |         "mrr": reciprocal_sum / total,</w:t>
-      </w:r>
-    </w:p>
-    <w:p>
-      <w:pPr>
-        <w:pStyle w:val="Heading2"/>
-      </w:pPr>
-      <w:r>
-        <w:t>16. Phân vị độ trễ</w:t>
-      </w:r>
-    </w:p>
-    <w:p>
-      <w:pPr>
-        <w:spacing w:before="160" w:after="40"/>
-      </w:pPr>
-      <w:r>
-        <w:rPr>
-          <w:b/>
-          <w:sz w:val="20"/>
-        </w:rPr>
-        <w:t>Công thức</w:t>
-      </w:r>
-    </w:p>
-    <w:p>
-      <w:pPr>
-        <w:spacing w:before="40" w:after="120"/>
-        <w:ind w:left="280"/>
-      </w:pPr>
-      <w:r>
-        <w:rPr>
-          <w:rFonts w:ascii="Consolas" w:hAnsi="Consolas"/>
-          <w:color w:val="000080"/>
-          <w:sz w:val="20"/>
-        </w:rPr>
-        <w:t>p50 = L[ ⌊N / 2⌋ ]</w:t>
-      </w:r>
-      <w:r>
-        <w:rPr>
-          <w:rFonts w:ascii="Consolas" w:hAnsi="Consolas"/>
-          <w:color w:val="000080"/>
-          <w:sz w:val="20"/>
-        </w:rPr>
-        <w:br/>
-        <w:t>p95 = L[ ⌊0,95 × N⌋ ]</w:t>
-      </w:r>
-      <w:r>
-        <w:rPr>
-          <w:rFonts w:ascii="Consolas" w:hAnsi="Consolas"/>
-          <w:color w:val="000080"/>
-          <w:sz w:val="20"/>
-        </w:rPr>
-        <w:br/>
-      </w:r>
-      <w:r>
-        <w:rPr>
-          <w:rFonts w:ascii="Consolas" w:hAnsi="Consolas"/>
-          <w:color w:val="000080"/>
-          <w:sz w:val="20"/>
-        </w:rPr>
-        <w:br/>
-        <w:t>L : mảng độ trễ đã sắp xếp tăng dần</w:t>
-      </w:r>
-    </w:p>
-    <w:p>
-      <w:pPr>
-        <w:spacing w:before="160" w:after="40"/>
-      </w:pPr>
-      <w:r>
-        <w:rPr>
-          <w:b/>
-          <w:sz w:val="20"/>
-        </w:rPr>
-        <w:t>Giải thích</w:t>
-      </w:r>
-    </w:p>
-    <w:p>
-      <w:pPr>
-        <w:spacing w:after="80"/>
-      </w:pPr>
-      <w:r>
-        <w:t>Đo bằng phân vị chứ không chỉ trung bình, vì trung bình che giấu phần đuôi chậm. Kết quả đo hiện tại (danh mục 12.137 mã, chạy trên GPU RTX 3050): trung bình 65 ms, p50 = 58 ms, p95 = 95 ms.</w:t>
-      </w:r>
-    </w:p>
-    <w:p>
-      <w:pPr>
-        <w:spacing w:before="160" w:after="40"/>
-      </w:pPr>
-      <w:r>
-        <w:rPr>
-          <w:b/>
-          <w:sz w:val="20"/>
-        </w:rPr>
-        <w:t>Vị trí: nlp/evaluate.py — dòng 99–101</w:t>
-      </w:r>
-      <w:r>
-        <w:br/>
-      </w:r>
-      <w:r>
-        <w:rPr>
-          <w:rFonts w:ascii="Consolas" w:hAnsi="Consolas"/>
-          <w:sz w:val="16"/>
-        </w:rPr>
-        <w:t>99 |             "mean": sum(latencies) / len(latencies),</w:t>
-      </w:r>
-      <w:r>
-        <w:rPr>
-          <w:rFonts w:ascii="Consolas" w:hAnsi="Consolas"/>
-          <w:sz w:val="16"/>
-        </w:rPr>
-        <w:br/>
-        <w:t>100 |             "p50": latencies[len(latencies) // 2],</w:t>
-      </w:r>
-      <w:r>
-        <w:rPr>
-          <w:rFonts w:ascii="Consolas" w:hAnsi="Consolas"/>
-          <w:sz w:val="16"/>
-        </w:rPr>
-        <w:br/>
-        <w:t>101 |             "p95": latencies[int(len(latencies) * 0.95)],</w:t>
-      </w:r>
-    </w:p>
-    <w:p>
-      <w:pPr>
-        <w:pStyle w:val="Heading1"/>
-      </w:pPr>
-      <w:r>
-        <w:lastRenderedPageBreak/>
-        <w:t>E. BĂM VÀ KIỂM CHỨNG CACHE</w:t>
-      </w:r>
-    </w:p>
-    <w:p>
-      <w:pPr>
-        <w:pStyle w:val="Heading2"/>
-      </w:pPr>
-      <w:r>
-        <w:t>17. Vân tay trọng số mô hình</w:t>
-      </w:r>
-    </w:p>
-    <w:p>
-      <w:pPr>
-        <w:spacing w:before="160" w:after="40"/>
-      </w:pPr>
-      <w:r>
-        <w:rPr>
-          <w:b/>
-          <w:sz w:val="20"/>
-        </w:rPr>
-        <w:t>Công thức</w:t>
-      </w:r>
-    </w:p>
-    <w:p>
-      <w:pPr>
-        <w:spacing w:before="40" w:after="120"/>
-        <w:ind w:left="280"/>
-      </w:pPr>
-      <w:r>
-        <w:rPr>
-          <w:rFonts w:ascii="Consolas" w:hAnsi="Consolas"/>
-          <w:color w:val="000080"/>
-          <w:sz w:val="20"/>
-        </w:rPr>
-        <w:t>fp = SHA1( ⊕_i [ tên_file_i ‖ kích_thước_i ‖ 1MB_đầu_i ‖ 1MB_cuối_i ] )[0:12]</w:t>
-      </w:r>
-    </w:p>
-    <w:p>
-      <w:pPr>
-        <w:spacing w:before="160" w:after="40"/>
-      </w:pPr>
-      <w:r>
-        <w:rPr>
-          <w:b/>
-          <w:sz w:val="20"/>
-        </w:rPr>
-        <w:t>Giải thích</w:t>
-      </w:r>
-    </w:p>
-    <w:p>
-      <w:pPr>
-        <w:spacing w:after="80"/>
-      </w:pPr>
-      <w:r>
-        <w:t>Băm 2 MB thay vì toàn bộ ~540 MB để không thêm vài giây vào mỗi lần khởi động; huấn luyện lại luôn làm đổi các byte này. Thiếu bước này, khi fine-tune lại vào cùng thư mục thì hệ thống vẫn nạp vector của checkpoint cũ: một truy vấn trùng khít mục từ chỉ đạt cosine 0,77 thay vì 1,0.</w:t>
-      </w:r>
-    </w:p>
-    <w:p>
-      <w:pPr>
-        <w:spacing w:before="160" w:after="40"/>
-      </w:pPr>
-      <w:r>
-        <w:rPr>
-          <w:b/>
-          <w:sz w:val="20"/>
-        </w:rPr>
-        <w:t>Vị trí: nlp/nlp_engine.py — dòng 194–236</w:t>
-      </w:r>
-    </w:p>
-    <w:p>
-      <w:pPr>
-        <w:spacing w:before="40" w:after="120"/>
-        <w:ind w:left="280"/>
-      </w:pPr>
-      <w:r>
-        <w:rPr>
-          <w:rFonts w:ascii="Consolas" w:hAnsi="Consolas"/>
-          <w:sz w:val="16"/>
-        </w:rPr>
-        <w:t>187 |     def _model_fingerprint(self) -&gt; str:</w:t>
-      </w:r>
-      <w:r>
-        <w:rPr>
-          <w:rFonts w:ascii="Consolas" w:hAnsi="Consolas"/>
-          <w:sz w:val="16"/>
-        </w:rPr>
-        <w:br/>
-        <w:t>188 |         """</w:t>
-      </w:r>
-      <w:r>
-        <w:rPr>
-          <w:rFonts w:ascii="Consolas" w:hAnsi="Consolas"/>
-          <w:sz w:val="16"/>
-        </w:rPr>
-        <w:br/>
-        <w:t>189 |         Vân tay của TRỌNG SỐ mô hình cục bộ.</w:t>
-      </w:r>
-      <w:r>
-        <w:rPr>
-          <w:rFonts w:ascii="Consolas" w:hAnsi="Consolas"/>
-          <w:sz w:val="16"/>
-        </w:rPr>
-        <w:br/>
-        <w:t xml:space="preserve">190 | </w:t>
-      </w:r>
-      <w:r>
-        <w:rPr>
-          <w:rFonts w:ascii="Consolas" w:hAnsi="Consolas"/>
-          <w:sz w:val="16"/>
-        </w:rPr>
-        <w:br/>
-        <w:t>191 |         Khóa cache bản trước chỉ gồm TÊN thư mục mô hình, nên khi fine-tune lại</w:t>
-      </w:r>
-      <w:r>
-        <w:rPr>
-          <w:rFonts w:ascii="Consolas" w:hAnsi="Consolas"/>
-          <w:sz w:val="16"/>
-        </w:rPr>
-        <w:br/>
-        <w:t>192 |         vào cùng thư mục, hệ thống vẫn nạp vector của checkpoint cũ: một truy vấn</w:t>
-      </w:r>
-      <w:r>
-        <w:rPr>
-          <w:rFonts w:ascii="Consolas" w:hAnsi="Consolas"/>
-          <w:sz w:val="16"/>
-        </w:rPr>
-        <w:br/>
-        <w:t>193 |         trùng khít mục từ ("đậu khỉ" -&gt; "Đậu khỉ") chỉ đạt cosine 0.77 thay vì</w:t>
-      </w:r>
-      <w:r>
-        <w:rPr>
-          <w:rFonts w:ascii="Consolas" w:hAnsi="Consolas"/>
-          <w:sz w:val="16"/>
-        </w:rPr>
-        <w:br/>
-        <w:t>194 |         1.0, kéo độ tin cậy xuống ~86% và làm lệch thứ hạng.</w:t>
-      </w:r>
-      <w:r>
-        <w:rPr>
-          <w:rFonts w:ascii="Consolas" w:hAnsi="Consolas"/>
-          <w:sz w:val="16"/>
-        </w:rPr>
-        <w:br/>
-        <w:t xml:space="preserve">195 | </w:t>
-      </w:r>
-      <w:r>
-        <w:rPr>
-          <w:rFonts w:ascii="Consolas" w:hAnsi="Consolas"/>
-          <w:sz w:val="16"/>
-        </w:rPr>
-        <w:br/>
-        <w:t>196 |         Chỉ băm kích thước + 1 MB đầu và 1 MB cuối của file trọng số thay vì toàn</w:t>
-      </w:r>
-      <w:r>
-        <w:rPr>
-          <w:rFonts w:ascii="Consolas" w:hAnsi="Consolas"/>
-          <w:sz w:val="16"/>
-        </w:rPr>
-        <w:br/>
-        <w:t>197 |         bộ ~540 MB, để không thêm vài giây vào mỗi lần khởi động; huấn luyện lại</w:t>
-      </w:r>
-      <w:r>
-        <w:rPr>
-          <w:rFonts w:ascii="Consolas" w:hAnsi="Consolas"/>
-          <w:sz w:val="16"/>
-        </w:rPr>
-        <w:br/>
-        <w:t>198 |         luôn làm đổi các byte này. Dùng NỘI DUNG file chứ không dùng mtime để</w:t>
-      </w:r>
-      <w:r>
-        <w:rPr>
-          <w:rFonts w:ascii="Consolas" w:hAnsi="Consolas"/>
-          <w:sz w:val="16"/>
-        </w:rPr>
-        <w:br/>
-        <w:t>199 |         cache vẫn hiệu lực khi chép dự án sang máy khác.</w:t>
-      </w:r>
-      <w:r>
-        <w:rPr>
-          <w:rFonts w:ascii="Consolas" w:hAnsi="Consolas"/>
-          <w:sz w:val="16"/>
-        </w:rPr>
-        <w:br/>
-        <w:t>200 |         """</w:t>
-      </w:r>
-      <w:r>
-        <w:rPr>
-          <w:rFonts w:ascii="Consolas" w:hAnsi="Consolas"/>
-          <w:sz w:val="16"/>
-        </w:rPr>
-        <w:br/>
-        <w:t>201 |         if self._fingerprint is not None:</w:t>
-      </w:r>
-      <w:r>
-        <w:rPr>
-          <w:rFonts w:ascii="Consolas" w:hAnsi="Consolas"/>
-          <w:sz w:val="16"/>
-        </w:rPr>
-        <w:br/>
-        <w:t>202 |             return self._fingerprint</w:t>
-      </w:r>
-      <w:r>
-        <w:rPr>
-          <w:rFonts w:ascii="Consolas" w:hAnsi="Consolas"/>
-          <w:sz w:val="16"/>
-        </w:rPr>
-        <w:br/>
-        <w:t xml:space="preserve">203 | </w:t>
-      </w:r>
-      <w:r>
-        <w:rPr>
-          <w:rFonts w:ascii="Consolas" w:hAnsi="Consolas"/>
-          <w:sz w:val="16"/>
-        </w:rPr>
-        <w:br/>
-        <w:t>204 |         if not os.path.isdir(self.model_name):</w:t>
-      </w:r>
-      <w:r>
-        <w:rPr>
-          <w:rFonts w:ascii="Consolas" w:hAnsi="Consolas"/>
-          <w:sz w:val="16"/>
-        </w:rPr>
-        <w:br/>
-        <w:t>205 |             # Mô hình trên hub: tên đã bao hàm định danh phiên bản.</w:t>
-      </w:r>
-      <w:r>
-        <w:rPr>
-          <w:rFonts w:ascii="Consolas" w:hAnsi="Consolas"/>
-          <w:sz w:val="16"/>
-        </w:rPr>
-        <w:br/>
-        <w:t>206 |             self._fingerprint = ""</w:t>
-      </w:r>
-      <w:r>
-        <w:rPr>
-          <w:rFonts w:ascii="Consolas" w:hAnsi="Consolas"/>
-          <w:sz w:val="16"/>
-        </w:rPr>
-        <w:br/>
-        <w:t>207 |             return self._fingerprint</w:t>
-      </w:r>
-      <w:r>
-        <w:rPr>
-          <w:rFonts w:ascii="Consolas" w:hAnsi="Consolas"/>
-          <w:sz w:val="16"/>
-        </w:rPr>
-        <w:br/>
-        <w:t xml:space="preserve">208 | </w:t>
-      </w:r>
-      <w:r>
-        <w:rPr>
-          <w:rFonts w:ascii="Consolas" w:hAnsi="Consolas"/>
-          <w:sz w:val="16"/>
-        </w:rPr>
-        <w:br/>
-        <w:t>209 |         chunk = 1 &lt;&lt; 20</w:t>
-      </w:r>
-      <w:r>
-        <w:rPr>
-          <w:rFonts w:ascii="Consolas" w:hAnsi="Consolas"/>
-          <w:sz w:val="16"/>
-        </w:rPr>
-        <w:br/>
-        <w:t>210 |         digest = hashlib.sha1()</w:t>
-      </w:r>
-      <w:r>
-        <w:rPr>
-          <w:rFonts w:ascii="Consolas" w:hAnsi="Consolas"/>
-          <w:sz w:val="16"/>
-        </w:rPr>
-        <w:br/>
-        <w:t>211 |         for relative in ("model.safetensors", "pytorch_model.bin", "model.onnx",</w:t>
-      </w:r>
-      <w:r>
-        <w:rPr>
-          <w:rFonts w:ascii="Consolas" w:hAnsi="Consolas"/>
-          <w:sz w:val="16"/>
-        </w:rPr>
-        <w:br/>
-        <w:t>212 |                          "config.json", "sentence_bert_config.json",</w:t>
-      </w:r>
-      <w:r>
-        <w:rPr>
-          <w:rFonts w:ascii="Consolas" w:hAnsi="Consolas"/>
-          <w:sz w:val="16"/>
-        </w:rPr>
-        <w:br/>
-        <w:t>213 |                          os.path.join("1_Pooling", "config.json")):</w:t>
-      </w:r>
-      <w:r>
-        <w:rPr>
-          <w:rFonts w:ascii="Consolas" w:hAnsi="Consolas"/>
-          <w:sz w:val="16"/>
-        </w:rPr>
-        <w:br/>
-        <w:t>214 |             path = os.path.join(self.model_name, relative)</w:t>
-      </w:r>
-      <w:r>
-        <w:rPr>
-          <w:rFonts w:ascii="Consolas" w:hAnsi="Consolas"/>
-          <w:sz w:val="16"/>
-        </w:rPr>
-        <w:br/>
-        <w:t>215 |             if not os.path.exists(path):</w:t>
-      </w:r>
-      <w:r>
-        <w:rPr>
-          <w:rFonts w:ascii="Consolas" w:hAnsi="Consolas"/>
-          <w:sz w:val="16"/>
-        </w:rPr>
-        <w:br/>
-        <w:t>216 |                 continue</w:t>
-      </w:r>
-      <w:r>
-        <w:rPr>
-          <w:rFonts w:ascii="Consolas" w:hAnsi="Consolas"/>
-          <w:sz w:val="16"/>
-        </w:rPr>
-        <w:br/>
-        <w:t>217 |             size = os.path.getsize(path)</w:t>
-      </w:r>
-      <w:r>
-        <w:rPr>
-          <w:rFonts w:ascii="Consolas" w:hAnsi="Consolas"/>
-          <w:sz w:val="16"/>
-        </w:rPr>
-        <w:br/>
-        <w:t>218 |             digest.update(f"{relative}:{size}".encode("utf-8"))</w:t>
-      </w:r>
-      <w:r>
-        <w:rPr>
-          <w:rFonts w:ascii="Consolas" w:hAnsi="Consolas"/>
-          <w:sz w:val="16"/>
-        </w:rPr>
-        <w:br/>
-        <w:t>219 |             try:</w:t>
-      </w:r>
-      <w:r>
-        <w:rPr>
-          <w:rFonts w:ascii="Consolas" w:hAnsi="Consolas"/>
-          <w:sz w:val="16"/>
-        </w:rPr>
-        <w:br/>
-        <w:t>220 |                 with open(path, "rb") as f:</w:t>
-      </w:r>
-      <w:r>
-        <w:rPr>
-          <w:rFonts w:ascii="Consolas" w:hAnsi="Consolas"/>
-          <w:sz w:val="16"/>
-        </w:rPr>
-        <w:br/>
-        <w:t>221 |                     digest.update(f.read(chunk))</w:t>
-      </w:r>
-      <w:r>
-        <w:rPr>
-          <w:rFonts w:ascii="Consolas" w:hAnsi="Consolas"/>
-          <w:sz w:val="16"/>
-        </w:rPr>
-        <w:br/>
-        <w:t>222 |                     if size &gt; 2 * chunk:</w:t>
-      </w:r>
-      <w:r>
-        <w:rPr>
-          <w:rFonts w:ascii="Consolas" w:hAnsi="Consolas"/>
-          <w:sz w:val="16"/>
-        </w:rPr>
-        <w:br/>
-        <w:t>223 |                         f.seek(-chunk, os.SEEK_END)</w:t>
-      </w:r>
-      <w:r>
-        <w:rPr>
-          <w:rFonts w:ascii="Consolas" w:hAnsi="Consolas"/>
-          <w:sz w:val="16"/>
-        </w:rPr>
-        <w:br/>
-        <w:t>224 |                         digest.update(f.read(chunk))</w:t>
-      </w:r>
-      <w:r>
-        <w:rPr>
-          <w:rFonts w:ascii="Consolas" w:hAnsi="Consolas"/>
-          <w:sz w:val="16"/>
-        </w:rPr>
-        <w:br/>
-        <w:t>225 |             except OSError:</w:t>
-      </w:r>
-      <w:r>
-        <w:rPr>
-          <w:rFonts w:ascii="Consolas" w:hAnsi="Consolas"/>
-          <w:sz w:val="16"/>
-        </w:rPr>
-        <w:br/>
-        <w:t>226 |                 continue</w:t>
-      </w:r>
-      <w:r>
-        <w:rPr>
-          <w:rFonts w:ascii="Consolas" w:hAnsi="Consolas"/>
-          <w:sz w:val="16"/>
-        </w:rPr>
-        <w:br/>
-        <w:t xml:space="preserve">227 | </w:t>
-      </w:r>
-      <w:r>
-        <w:rPr>
-          <w:rFonts w:ascii="Consolas" w:hAnsi="Consolas"/>
-          <w:sz w:val="16"/>
-        </w:rPr>
-        <w:br/>
-      </w:r>
-      <w:r>
-        <w:rPr>
-          <w:rFonts w:ascii="Consolas" w:hAnsi="Consolas"/>
-          <w:sz w:val="16"/>
-        </w:rPr>
-        <w:lastRenderedPageBreak/>
-        <w:t>228 |         self._fingerprint = digest.hexdigest()[:12]</w:t>
-      </w:r>
-      <w:r>
-        <w:rPr>
-          <w:rFonts w:ascii="Consolas" w:hAnsi="Consolas"/>
-          <w:sz w:val="16"/>
-        </w:rPr>
-        <w:br/>
-        <w:t>229 |         return self._fingerprint</w:t>
-      </w:r>
-    </w:p>
-    <w:p>
-      <w:pPr>
-        <w:pStyle w:val="Heading2"/>
-      </w:pPr>
-      <w:r>
-        <w:t>18. Hash nội dung danh mục</w:t>
-      </w:r>
-    </w:p>
-    <w:p>
-      <w:pPr>
-        <w:spacing w:before="160" w:after="40"/>
-      </w:pPr>
-      <w:r>
-        <w:rPr>
-          <w:b/>
-          <w:sz w:val="20"/>
-        </w:rPr>
-        <w:t>Công thức</w:t>
-      </w:r>
-    </w:p>
-    <w:p>
-      <w:pPr>
-        <w:spacing w:before="40" w:after="120"/>
-        <w:ind w:left="280"/>
-      </w:pPr>
-      <w:r>
-        <w:rPr>
-          <w:rFonts w:ascii="Consolas" w:hAnsi="Consolas"/>
-          <w:color w:val="000080"/>
-          <w:sz w:val="20"/>
-        </w:rPr>
-        <w:t>h = SHA1( ⊕_{e ∈ DB} [ code ‖ name_vi ‖ name_en ‖ synonyms ] )[0:12]</w:t>
-      </w:r>
-    </w:p>
-    <w:p>
-      <w:pPr>
-        <w:spacing w:before="160" w:after="40"/>
-      </w:pPr>
-      <w:r>
-        <w:rPr>
-          <w:b/>
-          <w:sz w:val="20"/>
-        </w:rPr>
-        <w:t>Giải thích</w:t>
-      </w:r>
-    </w:p>
-    <w:p>
-      <w:pPr>
-        <w:spacing w:after="80"/>
-      </w:pPr>
-      <w:r>
-        <w:t>Dùng hash NỘI DUNG danh mục thay cho số lượng bản ghi, để không bao giờ nạp nhầm cache cũ khi danh mục đổi nội dung mà giữ nguyên số dòng. Chính cơ chế này khiến việc chuẩn hóa Unicode NFC cho 198 mã tự động kích hoạt dựng lại cache.</w:t>
-      </w:r>
-    </w:p>
-    <w:p>
-      <w:pPr>
-        <w:spacing w:before="160" w:after="40"/>
-      </w:pPr>
-      <w:r>
-        <w:rPr>
-          <w:b/>
-          <w:sz w:val="20"/>
-        </w:rPr>
-        <w:t>Vị trí: nlp/nlp_engine.py — dòng 285–292</w:t>
-      </w:r>
-    </w:p>
-    <w:p>
-      <w:pPr>
-        <w:spacing w:before="40" w:after="120"/>
-        <w:ind w:left="280"/>
-      </w:pPr>
-      <w:r>
-        <w:rPr>
-          <w:rFonts w:ascii="Consolas" w:hAnsi="Consolas"/>
-          <w:sz w:val="16"/>
-        </w:rPr>
-        <w:t>278 |         digest = hashlib.sha1()</w:t>
-      </w:r>
-      <w:r>
-        <w:rPr>
-          <w:rFonts w:ascii="Consolas" w:hAnsi="Consolas"/>
-          <w:sz w:val="16"/>
-        </w:rPr>
-        <w:br/>
-        <w:t>279 |         for entry in self.db:</w:t>
-      </w:r>
-      <w:r>
-        <w:rPr>
-          <w:rFonts w:ascii="Consolas" w:hAnsi="Consolas"/>
-          <w:sz w:val="16"/>
-        </w:rPr>
-        <w:br/>
-        <w:t>280 |             digest.update(entry["code"].encode("utf-8"))</w:t>
-      </w:r>
-      <w:r>
-        <w:rPr>
-          <w:rFonts w:ascii="Consolas" w:hAnsi="Consolas"/>
-          <w:sz w:val="16"/>
-        </w:rPr>
-        <w:br/>
-        <w:t>281 |             digest.update(entry["name_vi"].encode("utf-8"))</w:t>
-      </w:r>
-      <w:r>
-        <w:rPr>
-          <w:rFonts w:ascii="Consolas" w:hAnsi="Consolas"/>
-          <w:sz w:val="16"/>
-        </w:rPr>
-        <w:br/>
-        <w:t>282 |             digest.update((entry.get("name_en") or "").encode("utf-8"))</w:t>
-      </w:r>
-      <w:r>
-        <w:rPr>
-          <w:rFonts w:ascii="Consolas" w:hAnsi="Consolas"/>
-          <w:sz w:val="16"/>
-        </w:rPr>
-        <w:br/>
-        <w:t>283 |             for syn in entry.get("synonyms", []):</w:t>
-      </w:r>
-      <w:r>
-        <w:rPr>
-          <w:rFonts w:ascii="Consolas" w:hAnsi="Consolas"/>
-          <w:sz w:val="16"/>
-        </w:rPr>
-        <w:br/>
-        <w:t>284 |                 digest.update(syn.encode("utf-8"))</w:t>
-      </w:r>
-      <w:r>
-        <w:rPr>
-          <w:rFonts w:ascii="Consolas" w:hAnsi="Consolas"/>
-          <w:sz w:val="16"/>
-        </w:rPr>
-        <w:br/>
-        <w:t>285 |         return model_key, digest.hexdigest()[:12]</w:t>
-      </w:r>
-    </w:p>
-    <w:p>
-      <w:pPr>
-        <w:pStyle w:val="Heading2"/>
-      </w:pPr>
-      <w:r>
-        <w:t>19. Kiểm chứng cache bằng mẫu dò</w:t>
-      </w:r>
-    </w:p>
-    <w:p>
-      <w:pPr>
-        <w:spacing w:before="160" w:after="40"/>
-      </w:pPr>
-      <w:r>
-        <w:rPr>
-          <w:b/>
-          <w:sz w:val="20"/>
-        </w:rPr>
-        <w:t>Công thức</w:t>
-      </w:r>
-    </w:p>
-    <w:p>
-      <w:pPr>
-        <w:spacing w:before="40" w:after="120"/>
-        <w:ind w:left="280"/>
-      </w:pPr>
-      <w:r>
-        <w:rPr>
-          <w:rFonts w:ascii="Consolas" w:hAnsi="Consolas"/>
-          <w:color w:val="000080"/>
-          <w:sz w:val="20"/>
-        </w:rPr>
-        <w:t>với i ∈ { 0, ⌊n/2⌋, n−1 } :</w:t>
-      </w:r>
-      <w:r>
-        <w:rPr>
-          <w:rFonts w:ascii="Consolas" w:hAnsi="Consolas"/>
-          <w:color w:val="000080"/>
-          <w:sz w:val="20"/>
-        </w:rPr>
-        <w:br/>
-        <w:t xml:space="preserve">    cos( encode(text_i), cache_i ) ≥ 0,999</w:t>
-      </w:r>
-      <w:r>
-        <w:rPr>
-          <w:rFonts w:ascii="Consolas" w:hAnsi="Consolas"/>
-          <w:color w:val="000080"/>
-          <w:sz w:val="20"/>
-        </w:rPr>
-        <w:br/>
-      </w:r>
-      <w:r>
-        <w:rPr>
-          <w:rFonts w:ascii="Consolas" w:hAnsi="Consolas"/>
-          <w:color w:val="000080"/>
-          <w:sz w:val="20"/>
-        </w:rPr>
-        <w:br/>
-        <w:t>cos(a,b) = (a · b) / (‖a‖ × ‖b‖)</w:t>
-      </w:r>
-    </w:p>
-    <w:p>
-      <w:pPr>
-        <w:spacing w:before="160" w:after="40"/>
-      </w:pPr>
-      <w:r>
-        <w:rPr>
-          <w:b/>
-          <w:sz w:val="20"/>
-        </w:rPr>
-        <w:t>Giải thích</w:t>
-      </w:r>
-    </w:p>
-    <w:p>
-      <w:pPr>
-        <w:spacing w:after="80"/>
-      </w:pPr>
-      <w:r>
-        <w:t>Lưới an toàn cuối cùng: mã hóa lại 3 mục từ mẫu rồi so cosine với vector tương ứng trong cache — cùng mô hình thì phải xấp xỉ 1,0. Cần thiết vì cache sai mô hình làm mọi điểm cosine lệch mà KHÔNG có lỗi nào được ném ra.</w:t>
-      </w:r>
-    </w:p>
-    <w:p>
-      <w:pPr>
-        <w:spacing w:before="160" w:after="40"/>
-      </w:pPr>
-      <w:r>
-        <w:rPr>
-          <w:b/>
-          <w:sz w:val="20"/>
-        </w:rPr>
-        <w:t>Vị trí: nlp/nlp_engine.py — dòng 238–264</w:t>
-      </w:r>
-    </w:p>
-    <w:p>
-      <w:pPr>
-        <w:spacing w:before="40" w:after="120"/>
-        <w:ind w:left="280"/>
-      </w:pPr>
-      <w:r>
-        <w:rPr>
-          <w:rFonts w:ascii="Consolas" w:hAnsi="Consolas"/>
-          <w:sz w:val="16"/>
-        </w:rPr>
         <w:t>231 |     def _cache_matches_model(self, emb_path: str, entries: List[dict]) -&gt; bool:</w:t>
       </w:r>
       <w:r>
@@ -4243,13 +4623,6 @@
           <w:sz w:val="16"/>
         </w:rPr>
         <w:br/>
-      </w:r>
-      <w:r>
-        <w:rPr>
-          <w:rFonts w:ascii="Consolas" w:hAnsi="Consolas"/>
-          <w:sz w:val="16"/>
-        </w:rPr>
-        <w:lastRenderedPageBreak/>
         <w:t>248 |             [self.normalize_text(entries[i]["text"]) for i in probes],</w:t>
       </w:r>
       <w:r>

</xml_diff>